<commit_message>
HY1 v1.1: paranda trükivead hüpnoteraapia dokumentides
- hüpoterapeudi → hünoterapeudi; lamba → lama; hetkil → hetkel
- integratsioonilause täiendatud; versioonid ja seotud failid uuendatud
- DOCX ja PDF genereeritud uuesti

Co-authored-by: reneealuste-commits <reneealuste-commits@users.noreply.github.com>
</commit_message>
<xml_diff>
--- a/Hypnoteraapia-HY1.docx
+++ b/Hypnoteraapia-HY1.docx
@@ -36,7 +36,7 @@
         <w:rPr>
           <w:sz w:val="20"/>
         </w:rPr>
-        <w:t>Unpluged-Al  |  16.08.2026  |  Hariduslik  |  v1.0</w:t>
+        <w:t>Unpluged-Al  |  16.08.2026  |  Hariduslik  |  v1.1</w:t>
       </w:r>
     </w:p>
     <w:tbl>
@@ -280,7 +280,7 @@
         <w:pStyle w:val="ListBullet"/>
       </w:pPr>
       <w:r>
-        <w:t>kiire imeravi koigele</w:t>
+        <w:t>kiire imeravi kõigele</w:t>
       </w:r>
     </w:p>
     <w:p>
@@ -361,7 +361,7 @@
                 <w:b/>
                 <w:sz w:val="20"/>
               </w:rPr>
-              <w:t>Kokkuvote</w:t>
+              <w:t>Kokkuvõte</w:t>
             </w:r>
           </w:p>
         </w:tc>
@@ -389,7 +389,7 @@
               <w:rPr>
                 <w:sz w:val="20"/>
               </w:rPr>
-              <w:t>Kiire abi stressile, uneale; keha kaudu ligipaas</w:t>
+              <w:t>Kiire abi stressile, uneale; keha kaudu ligipääs</w:t>
             </w:r>
           </w:p>
         </w:tc>
@@ -666,7 +666,7 @@
               <w:rPr>
                 <w:sz w:val="20"/>
               </w:rPr>
-              <w:t>Tosine haigus vajab spetsialisti</w:t>
+              <w:t>Tõsine haigus vajab spetsialisti</w:t>
             </w:r>
           </w:p>
         </w:tc>
@@ -881,7 +881,7 @@
               <w:rPr>
                 <w:sz w:val="20"/>
               </w:rPr>
-              <w:t>Ankur — hingamine sisse 4, valja 6 x 3</w:t>
+              <w:t>Ankur — hingamine sisse 4, välja 6 × 3</w:t>
             </w:r>
           </w:p>
         </w:tc>
@@ -1278,7 +1278,7 @@
               <w:rPr>
                 <w:sz w:val="20"/>
               </w:rPr>
-              <w:t>Sa SAAD igal hetkil silmad avada</w:t>
+              <w:t>Sa SAAD igal hetkel silmad avada</w:t>
             </w:r>
           </w:p>
         </w:tc>
@@ -1561,7 +1561,7 @@
               <w:rPr>
                 <w:sz w:val="20"/>
               </w:rPr>
-              <w:t>Uks eesmark korraga</w:t>
+              <w:t>Üks eesmärk korraga</w:t>
             </w:r>
           </w:p>
         </w:tc>
@@ -2171,7 +2171,7 @@
               <w:rPr>
                 <w:sz w:val="20"/>
               </w:rPr>
-              <w:t>Kirjutab integratsioonilause (debrief)</w:t>
+              <w:t>Kirjutab ühe integratsioonilause (debrief)</w:t>
             </w:r>
           </w:p>
         </w:tc>
@@ -2403,7 +2403,7 @@
               <w:rPr>
                 <w:sz w:val="20"/>
               </w:rPr>
-              <w:t>Grupi luhike HY1 — stress enne/pärast</w:t>
+              <w:t>Grupi lühike HY1 — stress enne/pärast</w:t>
             </w:r>
           </w:p>
         </w:tc>
@@ -2595,7 +2595,7 @@
           <w:color w:val="1B5E20"/>
           <w:sz w:val="20"/>
         </w:rPr>
-        <w:t>Täna ei muuda me teid kellegi teistsuguseks. Me harime fookust ja rahunemist. Te saate igal hetkil silmad avada. Üks eesmärk korraga.</w:t>
+        <w:t>Täna ei muuda me teid kellegi teistsuguseks. Me harime fookust ja rahunemist. Te saate igal hetkel silmad avada. Üks eesmärk korraga.</w:t>
       </w:r>
     </w:p>
     <w:p>
@@ -2643,7 +2643,7 @@
                 <w:b/>
                 <w:sz w:val="20"/>
               </w:rPr>
-              <w:t>Paev</w:t>
+              <w:t>Päev</w:t>
             </w:r>
           </w:p>
         </w:tc>
@@ -2657,7 +2657,7 @@
                 <w:b/>
                 <w:sz w:val="20"/>
               </w:rPr>
-              <w:t>Ulesanne</w:t>
+              <w:t>Ülesanne</w:t>
             </w:r>
           </w:p>
         </w:tc>
@@ -2685,7 +2685,7 @@
               <w:rPr>
                 <w:sz w:val="20"/>
               </w:rPr>
-              <w:t>1x HY1 (15 min) — logi stress enne/pärast</w:t>
+              <w:t>1× HY1 (15 min) — logi stress enne/pärast</w:t>
             </w:r>
           </w:p>
         </w:tc>
@@ -2713,7 +2713,7 @@
               <w:rPr>
                 <w:sz w:val="20"/>
               </w:rPr>
-              <w:t>1x 5-min kiirvariant enne olulist tegevust</w:t>
+              <w:t>1× 5-min kiirvariant enne olulist tegevust</w:t>
             </w:r>
           </w:p>
         </w:tc>
@@ -2793,7 +2793,7 @@
           <w:b w:val="0"/>
           <w:sz w:val="22"/>
         </w:rPr>
-        <w:t>Mina, ___________________________, osalesin HY1-G Hünoteraapia algteadmised.</w:t>
+        <w:t>Mina, ___________________________, osalesin HY1-G koolitusel „Hünoteraapia algteadmised".</w:t>
       </w:r>
     </w:p>
     <w:p>
@@ -2937,7 +2937,7 @@
           <w:color w:val="555555"/>
           <w:sz w:val="18"/>
         </w:rPr>
-        <w:t>HY1 v1.0  |  16.08.2026  |  Unpluged-Al  |  debrief-kaart-malevapealik.pdf</w:t>
+        <w:t>HY1 v1.1  |  16.08.2026  |  Unpluged-Al  |  debrief-kaart-malevapealik.pdf</w:t>
       </w:r>
     </w:p>
     <w:sectPr>

</xml_diff>

<commit_message>
HY1 v1.2: test nr 1 kaaslasega (Automaadi test vorming)
- Uus hypnoteraapia-test-nr1-kaaslasega.md/pdf: OT vead, käsklused, hindamine
- Iga mees juhib kaaslasele; juhend ja kaart uuendatud
- DOCX ja PDF genereerijad uuendatud

Co-authored-by: reneealuste-commits <reneealuste-commits@users.noreply.github.com>
</commit_message>
<xml_diff>
--- a/Hypnoteraapia-HY1.docx
+++ b/Hypnoteraapia-HY1.docx
@@ -36,7 +36,7 @@
         <w:rPr>
           <w:sz w:val="20"/>
         </w:rPr>
-        <w:t>Unpluged-Al  |  16.08.2026  |  Hariduslik  |  v1.1</w:t>
+        <w:t>Unpluged-Al  |  16.08.2026  |  Hariduslik  |  v1.2</w:t>
       </w:r>
     </w:p>
     <w:tbl>
@@ -2821,6 +2821,343 @@
     </w:p>
     <w:p>
       <w:pPr>
+        <w:pStyle w:val="Heading1"/>
+      </w:pPr>
+      <w:r>
+        <w:rPr>
+          <w:color w:val="1B5E20"/>
+        </w:rPr>
+        <w:t>OSA 4 — Hüpnoosi test nr. 1 (kaaslasega)</w:t>
+      </w:r>
+    </w:p>
+    <w:p>
+      <w:r>
+        <w:rPr>
+          <w:b/>
+          <w:sz w:val="22"/>
+        </w:rPr>
+        <w:t>Iga mees saab seda õppida ja teha oma kaaslasele. Vorm: kaitseväe Automaadi test nr. 1 eeskujul.</w:t>
+      </w:r>
+    </w:p>
+    <w:p>
+      <w:pPr>
+        <w:pStyle w:val="Heading2"/>
+      </w:pPr>
+      <w:r>
+        <w:rPr>
+          <w:color w:val="E65C00"/>
+        </w:rPr>
+        <w:t>Õppetunni eesmärk</w:t>
+      </w:r>
+    </w:p>
+    <w:p>
+      <w:r>
+        <w:rPr>
+          <w:b w:val="0"/>
+          <w:sz w:val="22"/>
+        </w:rPr>
+        <w:t>Kontrollida turvalise hüpnoosi juhtimise taset kaaslasega — 15 min protokoll ilma OT vigadeta.</w:t>
+      </w:r>
+    </w:p>
+    <w:p>
+      <w:pPr>
+        <w:pStyle w:val="Heading2"/>
+      </w:pPr>
+      <w:r>
+        <w:rPr>
+          <w:color w:val="E65C00"/>
+        </w:rPr>
+        <w:t>OT vead (test mittesooritatud)</w:t>
+      </w:r>
+    </w:p>
+    <w:p>
+      <w:pPr>
+        <w:pStyle w:val="ListBullet"/>
+      </w:pPr>
+      <w:r>
+        <w:t>Sundib silmi kinni / keelab lõpetamise</w:t>
+      </w:r>
+    </w:p>
+    <w:p>
+      <w:pPr>
+        <w:pStyle w:val="ListBullet"/>
+      </w:pPr>
+      <w:r>
+        <w:t>Avab trauma ilma spetsialistita</w:t>
+      </w:r>
+    </w:p>
+    <w:p>
+      <w:pPr>
+        <w:pStyle w:val="ListBullet"/>
+      </w:pPr>
+      <w:r>
+        <w:t>Jätkab kui distress &gt; 8/10</w:t>
+      </w:r>
+    </w:p>
+    <w:p>
+      <w:pPr>
+        <w:pStyle w:val="ListBullet"/>
+      </w:pPr>
+      <w:r>
+        <w:t>Diagnoosib või lubab meditsiinilist väidet</w:t>
+      </w:r>
+    </w:p>
+    <w:p>
+      <w:pPr>
+        <w:pStyle w:val="ListBullet"/>
+      </w:pPr>
+      <w:r>
+        <w:t>Alustab ilma nõusolekuta</w:t>
+      </w:r>
+    </w:p>
+    <w:p>
+      <w:pPr>
+        <w:pStyle w:val="Heading2"/>
+      </w:pPr>
+      <w:r>
+        <w:rPr>
+          <w:color w:val="E65C00"/>
+        </w:rPr>
+        <w:t>Protseduur — peamised käsklused</w:t>
+      </w:r>
+    </w:p>
+    <w:tbl>
+      <w:tblPr>
+        <w:tblStyle w:val="TableGrid"/>
+        <w:tblW w:type="auto" w:w="0"/>
+        <w:tblLook w:firstColumn="1" w:firstRow="1" w:lastColumn="0" w:lastRow="0" w:noHBand="0" w:noVBand="1" w:val="04A0"/>
+      </w:tblPr>
+      <w:tblGrid>
+        <w:gridCol w:w="4703"/>
+        <w:gridCol w:w="4703"/>
+      </w:tblGrid>
+      <w:tr>
+        <w:tc>
+          <w:tcPr>
+            <w:tcW w:type="dxa" w:w="4703"/>
+          </w:tcPr>
+          <w:p>
+            <w:r>
+              <w:rPr>
+                <w:b/>
+                <w:sz w:val="20"/>
+              </w:rPr>
+              <w:t>#</w:t>
+            </w:r>
+          </w:p>
+        </w:tc>
+        <w:tc>
+          <w:tcPr>
+            <w:tcW w:type="dxa" w:w="4703"/>
+          </w:tcPr>
+          <w:p>
+            <w:r>
+              <w:rPr>
+                <w:b/>
+                <w:sz w:val="20"/>
+              </w:rPr>
+              <w:t>Käsklus</w:t>
+            </w:r>
+          </w:p>
+        </w:tc>
+      </w:tr>
+      <w:tr>
+        <w:tc>
+          <w:tcPr>
+            <w:tcW w:type="dxa" w:w="4703"/>
+          </w:tcPr>
+          <w:p>
+            <w:r>
+              <w:rPr>
+                <w:sz w:val="20"/>
+              </w:rPr>
+              <w:t>1</w:t>
+            </w:r>
+          </w:p>
+        </w:tc>
+        <w:tc>
+          <w:tcPr>
+            <w:tcW w:type="dxa" w:w="4703"/>
+          </w:tcPr>
+          <w:p>
+            <w:r>
+              <w:rPr>
+                <w:sz w:val="20"/>
+              </w:rPr>
+              <w:t>Liikuge vaiksesse ruumi ja tehke ohutuskontroll</w:t>
+            </w:r>
+          </w:p>
+        </w:tc>
+      </w:tr>
+      <w:tr>
+        <w:tc>
+          <w:tcPr>
+            <w:tcW w:type="dxa" w:w="4703"/>
+          </w:tcPr>
+          <w:p>
+            <w:r>
+              <w:rPr>
+                <w:sz w:val="20"/>
+              </w:rPr>
+              <w:t>2</w:t>
+            </w:r>
+          </w:p>
+        </w:tc>
+        <w:tc>
+          <w:tcPr>
+            <w:tcW w:type="dxa" w:w="4703"/>
+          </w:tcPr>
+          <w:p>
+            <w:r>
+              <w:rPr>
+                <w:sz w:val="20"/>
+              </w:rPr>
+              <w:t>Lepi kokku üks eesmärk</w:t>
+            </w:r>
+          </w:p>
+        </w:tc>
+      </w:tr>
+      <w:tr>
+        <w:tc>
+          <w:tcPr>
+            <w:tcW w:type="dxa" w:w="4703"/>
+          </w:tcPr>
+          <w:p>
+            <w:r>
+              <w:rPr>
+                <w:sz w:val="20"/>
+              </w:rPr>
+              <w:t>3</w:t>
+            </w:r>
+          </w:p>
+        </w:tc>
+        <w:tc>
+          <w:tcPr>
+            <w:tcW w:type="dxa" w:w="4703"/>
+          </w:tcPr>
+          <w:p>
+            <w:r>
+              <w:rPr>
+                <w:sz w:val="20"/>
+              </w:rPr>
+              <w:t>Sul on alati kontroll. Ava silmad igal hetkel</w:t>
+            </w:r>
+          </w:p>
+        </w:tc>
+      </w:tr>
+      <w:tr>
+        <w:tc>
+          <w:tcPr>
+            <w:tcW w:type="dxa" w:w="4703"/>
+          </w:tcPr>
+          <w:p>
+            <w:r>
+              <w:rPr>
+                <w:sz w:val="20"/>
+              </w:rPr>
+              <w:t>4</w:t>
+            </w:r>
+          </w:p>
+        </w:tc>
+        <w:tc>
+          <w:tcPr>
+            <w:tcW w:type="dxa" w:w="4703"/>
+          </w:tcPr>
+          <w:p>
+            <w:r>
+              <w:rPr>
+                <w:sz w:val="20"/>
+              </w:rPr>
+              <w:t>Ankur — sisse 4, välja 6 × 3</w:t>
+            </w:r>
+          </w:p>
+        </w:tc>
+      </w:tr>
+      <w:tr>
+        <w:tc>
+          <w:tcPr>
+            <w:tcW w:type="dxa" w:w="4703"/>
+          </w:tcPr>
+          <w:p>
+            <w:r>
+              <w:rPr>
+                <w:sz w:val="20"/>
+              </w:rPr>
+              <w:t>5</w:t>
+            </w:r>
+          </w:p>
+        </w:tc>
+        <w:tc>
+          <w:tcPr>
+            <w:tcW w:type="dxa" w:w="4703"/>
+          </w:tcPr>
+          <w:p>
+            <w:r>
+              <w:rPr>
+                <w:sz w:val="20"/>
+              </w:rPr>
+              <w:t>Keha skaneering → Turvakoht → Suggestioon 8-12 min</w:t>
+            </w:r>
+          </w:p>
+        </w:tc>
+      </w:tr>
+      <w:tr>
+        <w:tc>
+          <w:tcPr>
+            <w:tcW w:type="dxa" w:w="4703"/>
+          </w:tcPr>
+          <w:p>
+            <w:r>
+              <w:rPr>
+                <w:sz w:val="20"/>
+              </w:rPr>
+              <w:t>6</w:t>
+            </w:r>
+          </w:p>
+        </w:tc>
+        <w:tc>
+          <w:tcPr>
+            <w:tcW w:type="dxa" w:w="4703"/>
+          </w:tcPr>
+          <w:p>
+            <w:r>
+              <w:rPr>
+                <w:sz w:val="20"/>
+              </w:rPr>
+              <w:t>Tagasi 5-1 → Vesi → Mis muutus?</w:t>
+            </w:r>
+          </w:p>
+        </w:tc>
+      </w:tr>
+    </w:tbl>
+    <w:p/>
+    <w:p>
+      <w:pPr>
+        <w:pStyle w:val="Heading2"/>
+      </w:pPr>
+      <w:r>
+        <w:rPr>
+          <w:color w:val="E65C00"/>
+        </w:rPr>
+        <w:t>Hindamine</w:t>
+      </w:r>
+    </w:p>
+    <w:p>
+      <w:r>
+        <w:rPr>
+          <w:b w:val="0"/>
+          <w:sz w:val="22"/>
+        </w:rPr>
+        <w:t>Sooritatud: 0 OT viga + min 14 punkti 18-st. Kaaslane kinnitab: Sain igal hetkel lõpetada.</w:t>
+      </w:r>
+    </w:p>
+    <w:p>
+      <w:r>
+        <w:br w:type="page"/>
+      </w:r>
+    </w:p>
+    <w:p>
+      <w:pPr>
         <w:pStyle w:val="Heading2"/>
       </w:pPr>
       <w:r>
@@ -2937,7 +3274,7 @@
           <w:color w:val="555555"/>
           <w:sz w:val="18"/>
         </w:rPr>
-        <w:t>HY1 v1.1  |  16.08.2026  |  Unpluged-Al  |  debrief-kaart-malevapealik.pdf</w:t>
+        <w:t>HY1 v1.2  |  16.08.2026  |  Unpluged-Al  |  hypnoteraapia-test-nr1-kaaslasega.md</w:t>
       </w:r>
     </w:p>
     <w:sectPr>

</xml_diff>

<commit_message>
HY1 v2.0: juhend EMDR eeskuju vormingus (ise + paariline)
- Struktuur: OLULINE, 7 sammu, paariline protokoll, STOP, näited
- Iga mees saab õppida ja teha kaaslasele; DOCX/PDF uuendatud

Co-authored-by: reneealuste-commits <reneealuste-commits@users.noreply.github.com>
</commit_message>
<xml_diff>
--- a/Hypnoteraapia-HY1.docx
+++ b/Hypnoteraapia-HY1.docx
@@ -10,9 +10,9 @@
         <w:rPr>
           <w:b/>
           <w:color w:val="1B5E20"/>
-          <w:sz w:val="52"/>
+          <w:sz w:val="36"/>
         </w:rPr>
-        <w:t>HÜNOTERAAPIA HY1</w:t>
+        <w:t>Hüpnoteraapia juhised algajale</w:t>
       </w:r>
     </w:p>
     <w:p>
@@ -21,194 +21,72 @@
       </w:pPr>
       <w:r>
         <w:rPr>
-          <w:color w:val="555555"/>
-          <w:sz w:val="28"/>
+          <w:sz w:val="22"/>
         </w:rPr>
-        <w:t>Juhend · Koolituskaart · Plaankonspekt</w:t>
+        <w:t>Iseendale ja paarilisele kodus</w:t>
       </w:r>
     </w:p>
-    <w:p/>
     <w:p>
       <w:pPr>
         <w:jc w:val="center"/>
       </w:pPr>
       <w:r>
         <w:rPr>
-          <w:sz w:val="20"/>
+          <w:sz w:val="22"/>
         </w:rPr>
-        <w:t>Unpluged-Al  |  16.08.2026  |  Hariduslik  |  v1.2</w:t>
+        <w:t>Lihtsad sammud turvalise hüpnoosiga — 15–25 minutit</w:t>
       </w:r>
     </w:p>
-    <w:tbl>
-      <w:tblPr>
-        <w:tblStyle w:val="TableGrid"/>
-        <w:tblW w:type="auto" w:w="0"/>
-        <w:tblLook w:firstColumn="1" w:firstRow="1" w:lastColumn="0" w:lastRow="0" w:noHBand="0" w:noVBand="1" w:val="04A0"/>
-      </w:tblPr>
-      <w:tblGrid>
-        <w:gridCol w:w="4703"/>
-        <w:gridCol w:w="4703"/>
-      </w:tblGrid>
-      <w:tr>
-        <w:tc>
-          <w:tcPr>
-            <w:tcW w:type="dxa" w:w="4703"/>
-          </w:tcPr>
-          <w:p>
-            <w:r>
-              <w:rPr>
-                <w:b/>
-                <w:sz w:val="20"/>
-              </w:rPr>
-              <w:t>Vali</w:t>
-            </w:r>
-          </w:p>
-        </w:tc>
-        <w:tc>
-          <w:tcPr>
-            <w:tcW w:type="dxa" w:w="4703"/>
-          </w:tcPr>
-          <w:p>
-            <w:r>
-              <w:rPr>
-                <w:b/>
-                <w:sz w:val="20"/>
-              </w:rPr>
-              <w:t>Andmed</w:t>
-            </w:r>
-          </w:p>
-        </w:tc>
-      </w:tr>
-      <w:tr>
-        <w:tc>
-          <w:tcPr>
-            <w:tcW w:type="dxa" w:w="4703"/>
-          </w:tcPr>
-          <w:p>
-            <w:r>
-              <w:rPr>
-                <w:sz w:val="20"/>
-              </w:rPr>
-              <w:t>Kood</w:t>
-            </w:r>
-          </w:p>
-        </w:tc>
-        <w:tc>
-          <w:tcPr>
-            <w:tcW w:type="dxa" w:w="4703"/>
-          </w:tcPr>
-          <w:p>
-            <w:r>
-              <w:rPr>
-                <w:sz w:val="20"/>
-              </w:rPr>
-              <w:t>HY1 (ise/paar) · HY1-G (grupp 90 min)</w:t>
-            </w:r>
-          </w:p>
-        </w:tc>
-      </w:tr>
-      <w:tr>
-        <w:tc>
-          <w:tcPr>
-            <w:tcW w:type="dxa" w:w="4703"/>
-          </w:tcPr>
-          <w:p>
-            <w:r>
-              <w:rPr>
-                <w:sz w:val="20"/>
-              </w:rPr>
-              <w:t>Teema</w:t>
-            </w:r>
-          </w:p>
-        </w:tc>
-        <w:tc>
-          <w:tcPr>
-            <w:tcW w:type="dxa" w:w="4703"/>
-          </w:tcPr>
-          <w:p>
-            <w:r>
-              <w:rPr>
-                <w:sz w:val="20"/>
-              </w:rPr>
-              <w:t>Turvaline hüpnoos — fookus, lõdvestus, eneseregulatsioon</w:t>
-            </w:r>
-          </w:p>
-        </w:tc>
-      </w:tr>
-      <w:tr>
-        <w:tc>
-          <w:tcPr>
-            <w:tcW w:type="dxa" w:w="4703"/>
-          </w:tcPr>
-          <w:p>
-            <w:r>
-              <w:rPr>
-                <w:sz w:val="20"/>
-              </w:rPr>
-              <w:t>Kestus</w:t>
-            </w:r>
-          </w:p>
-        </w:tc>
-        <w:tc>
-          <w:tcPr>
-            <w:tcW w:type="dxa" w:w="4703"/>
-          </w:tcPr>
-          <w:p>
-            <w:r>
-              <w:rPr>
-                <w:sz w:val="20"/>
-              </w:rPr>
-              <w:t>15-25 min kodus · 90 min grupikoolitus</w:t>
-            </w:r>
-          </w:p>
-        </w:tc>
-      </w:tr>
-      <w:tr>
-        <w:tc>
-          <w:tcPr>
-            <w:tcW w:type="dxa" w:w="4703"/>
-          </w:tcPr>
-          <w:p>
-            <w:r>
-              <w:rPr>
-                <w:sz w:val="20"/>
-              </w:rPr>
-              <w:t>Eeldus</w:t>
-            </w:r>
-          </w:p>
-        </w:tc>
-        <w:tc>
-          <w:tcPr>
-            <w:tcW w:type="dxa" w:w="4703"/>
-          </w:tcPr>
-          <w:p>
-            <w:r>
-              <w:rPr>
-                <w:sz w:val="20"/>
-              </w:rPr>
-              <w:t>MITTE trauma/PTSD/kriis — siis spetsialist</w:t>
-            </w:r>
-          </w:p>
-        </w:tc>
-      </w:tr>
-    </w:tbl>
     <w:p/>
     <w:p>
       <w:pPr>
-        <w:ind w:left="567"/>
+        <w:pStyle w:val="Heading1"/>
       </w:pPr>
       <w:r>
         <w:rPr>
-          <w:i/>
           <w:color w:val="1B5E20"/>
-          <w:sz w:val="20"/>
         </w:rPr>
-        <w:t>See dokument on hariduslik. Ei asenda psühholoogi, psühhiaatri ega sertifitseeritud hünoterapeudi abi.</w:t>
+        <w:t>OLULINE — loe enne alustamist</w:t>
       </w:r>
     </w:p>
     <w:p>
+      <w:pPr>
+        <w:pStyle w:val="ListBullet"/>
+      </w:pPr>
       <w:r>
-        <w:br w:type="page"/>
+        <w:t>Kerge stress, uni, fookus — MITTE trauma või PTSD raviks.</w:t>
+      </w:r>
+    </w:p>
+    <w:p>
+      <w:pPr>
+        <w:pStyle w:val="ListBullet"/>
+      </w:pPr>
+      <w:r>
+        <w:t>Raske trauma, enesetapumõtted, dissotsiatsioon → hünoterapeudi poole.</w:t>
+      </w:r>
+    </w:p>
+    <w:p>
+      <w:pPr>
+        <w:pStyle w:val="ListBullet"/>
+      </w:pPr>
+      <w:r>
+        <w:t>Distress üle 8/10 → lõpeta kohe (punkt 5).</w:t>
+      </w:r>
+    </w:p>
+    <w:p>
+      <w:pPr>
+        <w:pStyle w:val="ListBullet"/>
+      </w:pPr>
+      <w:r>
+        <w:t>Paariline töö nõuab usaldust. Piisab ühest kergest eesmärgist.</w:t>
+      </w:r>
+    </w:p>
+    <w:p>
+      <w:pPr>
+        <w:pStyle w:val="ListBullet"/>
+      </w:pPr>
+      <w:r>
+        <w:t>Iga mees saab seda õppida ja teha oma kaaslasele.</w:t>
       </w:r>
     </w:p>
     <w:p>
@@ -219,893 +97,232 @@
         <w:rPr>
           <w:color w:val="1B5E20"/>
         </w:rPr>
-        <w:t>OSA 1 — Algaja juhend</w:t>
-      </w:r>
-    </w:p>
-    <w:p>
-      <w:pPr>
-        <w:pStyle w:val="Heading2"/>
-      </w:pPr>
-      <w:r>
-        <w:rPr>
-          <w:color w:val="E65C00"/>
-        </w:rPr>
-        <w:t>1. Mis on hünoteraapia?</w:t>
+        <w:t>Mis on hüpnoteraapia?</w:t>
       </w:r>
     </w:p>
     <w:p>
       <w:r>
         <w:rPr>
           <w:b w:val="0"/>
+          <w:i w:val="0"/>
           <w:sz w:val="22"/>
         </w:rPr>
-        <w:t>Hünoteraapia kasutab hüpnoosi — fookustatud tähelepanu ja suuremat vastuvõtlikkust soovitud sisule — et aidata muuta mõtteid, tundeid, keha reaktsioone või käitumist.</w:t>
+        <w:t>Hüpnoteraapia kasutab hüpnoosi — fookustatud tähelepanu ja lõdvestust. Kodus lihtsustatud versioon. Ei asenda terapeuti. Sa kuuled, tunned keha, saad silmad avada.</w:t>
+      </w:r>
+    </w:p>
+    <w:p>
+      <w:pPr>
+        <w:pStyle w:val="Heading1"/>
+      </w:pPr>
+      <w:r>
+        <w:rPr>
+          <w:color w:val="1B5E20"/>
+        </w:rPr>
+        <w:t>1. Valmistumine (mõlemale)</w:t>
+      </w:r>
+    </w:p>
+    <w:p>
+      <w:r>
+        <w:rPr>
+          <w:b w:val="0"/>
+          <w:i w:val="0"/>
+          <w:sz w:val="22"/>
+        </w:rPr>
+        <w:t>1. Vali vaikne koht. Istu või lama. Vesi lähedal.</w:t>
+      </w:r>
+    </w:p>
+    <w:p>
+      <w:r>
+        <w:rPr>
+          <w:b w:val="0"/>
+          <w:i w:val="0"/>
+          <w:sz w:val="22"/>
+        </w:rPr>
+        <w:t>2. Vali meetod: ise · salvestis · paariline.</w:t>
+      </w:r>
+    </w:p>
+    <w:p>
+      <w:r>
+        <w:rPr>
+          <w:b w:val="0"/>
+          <w:i w:val="0"/>
+          <w:sz w:val="22"/>
+        </w:rPr>
+        <w:t>3. Hinda distressi 0–10. Kirjuta üles.</w:t>
+      </w:r>
+    </w:p>
+    <w:p>
+      <w:r>
+        <w:rPr>
+          <w:b w:val="0"/>
+          <w:i w:val="0"/>
+          <w:sz w:val="22"/>
+        </w:rPr>
+        <w:t>4. Vali üks eesmärk: rahunemine, uni või fookus.</w:t>
+      </w:r>
+    </w:p>
+    <w:p>
+      <w:r>
+        <w:rPr>
+          <w:b w:val="0"/>
+          <w:i w:val="0"/>
+          <w:sz w:val="22"/>
+        </w:rPr>
+        <w:t>5. Sea taimer 15–25 minutile.</w:t>
+      </w:r>
+    </w:p>
+    <w:p>
+      <w:pPr>
+        <w:pStyle w:val="Heading1"/>
+      </w:pPr>
+      <w:r>
+        <w:rPr>
+          <w:color w:val="1B5E20"/>
+        </w:rPr>
+        <w:t>2. Meetodid — vali üks</w:t>
       </w:r>
     </w:p>
     <w:p>
       <w:r>
         <w:rPr>
           <w:b/>
+          <w:i w:val="0"/>
           <w:sz w:val="22"/>
         </w:rPr>
-        <w:t>See EI OLE:</w:t>
-      </w:r>
-    </w:p>
-    <w:p>
-      <w:pPr>
-        <w:pStyle w:val="ListBullet"/>
-      </w:pPr>
-      <w:r>
-        <w:t>une peale sundimine</w:t>
-      </w:r>
-    </w:p>
-    <w:p>
-      <w:pPr>
-        <w:pStyle w:val="ListBullet"/>
-      </w:pPr>
-      <w:r>
-        <w:t>tahte kaotamine</w:t>
-      </w:r>
-    </w:p>
-    <w:p>
-      <w:pPr>
-        <w:pStyle w:val="ListBullet"/>
-      </w:pPr>
-      <w:r>
-        <w:t>kontrolli kaotamine</w:t>
-      </w:r>
-    </w:p>
-    <w:p>
-      <w:pPr>
-        <w:pStyle w:val="ListBullet"/>
-      </w:pPr>
-      <w:r>
-        <w:t>kiire imeravi kõigele</w:t>
+        <w:t>A. Ise — loe skripti vaikselt</w:t>
       </w:r>
     </w:p>
     <w:p>
       <w:r>
         <w:rPr>
           <w:b/>
+          <w:i w:val="0"/>
           <w:sz w:val="22"/>
         </w:rPr>
-        <w:t>See ON:</w:t>
+        <w:t>B. Salvestis — kuula kõrvaklappidega</w:t>
+      </w:r>
+    </w:p>
+    <w:p>
+      <w:r>
+        <w:rPr>
+          <w:b/>
+          <w:i w:val="0"/>
+          <w:sz w:val="22"/>
+        </w:rPr>
+        <w:t>C. Paariline — teine loeb aeglaselt</w:t>
       </w:r>
     </w:p>
     <w:p>
       <w:pPr>
-        <w:pStyle w:val="ListBullet"/>
-      </w:pPr>
-      <w:r>
-        <w:t>suunatud protsess ühe eesmärgiga</w:t>
-      </w:r>
-    </w:p>
-    <w:p>
-      <w:pPr>
-        <w:pStyle w:val="ListBullet"/>
-      </w:pPr>
-      <w:r>
-        <w:t>turvalisuse ja nõusoleku peal</w:t>
-      </w:r>
-    </w:p>
-    <w:p>
-      <w:pPr>
-        <w:pStyle w:val="ListBullet"/>
-      </w:pPr>
-      <w:r>
-        <w:t>sageli koos KVT, lõdvestus- või käitumisteraapiaga</w:t>
-      </w:r>
-    </w:p>
-    <w:p>
-      <w:pPr>
-        <w:pStyle w:val="Heading2"/>
+        <w:pStyle w:val="Heading1"/>
       </w:pPr>
       <w:r>
         <w:rPr>
-          <w:color w:val="E65C00"/>
+          <w:color w:val="1B5E20"/>
         </w:rPr>
-        <w:t>SWOT — lühikokkuvõte</w:t>
+        <w:t>3. Iseendale — samm-sammult</w:t>
       </w:r>
     </w:p>
-    <w:tbl>
-      <w:tblPr>
-        <w:tblStyle w:val="TableGrid"/>
-        <w:tblW w:type="auto" w:w="0"/>
-        <w:tblLook w:firstColumn="1" w:firstRow="1" w:lastColumn="0" w:lastRow="0" w:noHBand="0" w:noVBand="1" w:val="04A0"/>
-      </w:tblPr>
-      <w:tblGrid>
-        <w:gridCol w:w="4703"/>
-        <w:gridCol w:w="4703"/>
-      </w:tblGrid>
-      <w:tr>
-        <w:tc>
-          <w:tcPr>
-            <w:tcW w:type="dxa" w:w="4703"/>
-          </w:tcPr>
-          <w:p>
-            <w:r>
-              <w:rPr>
-                <w:b/>
-                <w:sz w:val="20"/>
-              </w:rPr>
-            </w:r>
-          </w:p>
-        </w:tc>
-        <w:tc>
-          <w:tcPr>
-            <w:tcW w:type="dxa" w:w="4703"/>
-          </w:tcPr>
-          <w:p>
-            <w:r>
-              <w:rPr>
-                <w:b/>
-                <w:sz w:val="20"/>
-              </w:rPr>
-              <w:t>Kokkuvõte</w:t>
-            </w:r>
-          </w:p>
-        </w:tc>
-      </w:tr>
-      <w:tr>
-        <w:tc>
-          <w:tcPr>
-            <w:tcW w:type="dxa" w:w="4703"/>
-          </w:tcPr>
-          <w:p>
-            <w:r>
-              <w:rPr>
-                <w:sz w:val="20"/>
-              </w:rPr>
-              <w:t>Tugevused</w:t>
-            </w:r>
-          </w:p>
-        </w:tc>
-        <w:tc>
-          <w:tcPr>
-            <w:tcW w:type="dxa" w:w="4703"/>
-          </w:tcPr>
-          <w:p>
-            <w:r>
-              <w:rPr>
-                <w:sz w:val="20"/>
-              </w:rPr>
-              <w:t>Kiire abi stressile, uneale; keha kaudu ligipääs</w:t>
-            </w:r>
-          </w:p>
-        </w:tc>
-      </w:tr>
-      <w:tr>
-        <w:tc>
-          <w:tcPr>
-            <w:tcW w:type="dxa" w:w="4703"/>
-          </w:tcPr>
-          <w:p>
-            <w:r>
-              <w:rPr>
-                <w:sz w:val="20"/>
-              </w:rPr>
-              <w:t>Nõrkused</w:t>
-            </w:r>
-          </w:p>
-        </w:tc>
-        <w:tc>
-          <w:tcPr>
-            <w:tcW w:type="dxa" w:w="4703"/>
-          </w:tcPr>
-          <w:p>
-            <w:r>
-              <w:rPr>
-                <w:sz w:val="20"/>
-              </w:rPr>
-              <w:t>Kvaliteet kõikub; vale arusaam avalikkuses</w:t>
-            </w:r>
-          </w:p>
-        </w:tc>
-      </w:tr>
-      <w:tr>
-        <w:tc>
-          <w:tcPr>
-            <w:tcW w:type="dxa" w:w="4703"/>
-          </w:tcPr>
-          <w:p>
-            <w:r>
-              <w:rPr>
-                <w:sz w:val="20"/>
-              </w:rPr>
-              <w:t>Võimalused</w:t>
-            </w:r>
-          </w:p>
-        </w:tc>
-        <w:tc>
-          <w:tcPr>
-            <w:tcW w:type="dxa" w:w="4703"/>
-          </w:tcPr>
-          <w:p>
-            <w:r>
-              <w:rPr>
-                <w:sz w:val="20"/>
-              </w:rPr>
-              <w:t>Juhtimine, debrief, tervishoid</w:t>
-            </w:r>
-          </w:p>
-        </w:tc>
-      </w:tr>
-      <w:tr>
-        <w:tc>
-          <w:tcPr>
-            <w:tcW w:type="dxa" w:w="4703"/>
-          </w:tcPr>
-          <w:p>
-            <w:r>
-              <w:rPr>
-                <w:sz w:val="20"/>
-              </w:rPr>
-              <w:t>Ohud</w:t>
-            </w:r>
-          </w:p>
-        </w:tc>
-        <w:tc>
-          <w:tcPr>
-            <w:tcW w:type="dxa" w:w="4703"/>
-          </w:tcPr>
-          <w:p>
-            <w:r>
-              <w:rPr>
-                <w:sz w:val="20"/>
-              </w:rPr>
-              <w:t>Ülemüük; trauma vale käsitlus; asendada ravi</w:t>
-            </w:r>
-          </w:p>
-        </w:tc>
-      </w:tr>
-    </w:tbl>
-    <w:p/>
-    <w:p>
-      <w:pPr>
-        <w:pStyle w:val="Heading2"/>
-      </w:pPr>
-      <w:r>
-        <w:rPr>
-          <w:color w:val="E65C00"/>
-        </w:rPr>
-        <w:t>2. Turvalisuse reeglid (KOHUSTUSLIK)</w:t>
-      </w:r>
-    </w:p>
-    <w:tbl>
-      <w:tblPr>
-        <w:tblStyle w:val="TableGrid"/>
-        <w:tblW w:type="auto" w:w="0"/>
-        <w:tblLook w:firstColumn="1" w:firstRow="1" w:lastColumn="0" w:lastRow="0" w:noHBand="0" w:noVBand="1" w:val="04A0"/>
-      </w:tblPr>
-      <w:tblGrid>
-        <w:gridCol w:w="4703"/>
-        <w:gridCol w:w="4703"/>
-      </w:tblGrid>
-      <w:tr>
-        <w:tc>
-          <w:tcPr>
-            <w:tcW w:type="dxa" w:w="4703"/>
-          </w:tcPr>
-          <w:p>
-            <w:r>
-              <w:rPr>
-                <w:b/>
-                <w:sz w:val="20"/>
-              </w:rPr>
-              <w:t>Reegel</w:t>
-            </w:r>
-          </w:p>
-        </w:tc>
-        <w:tc>
-          <w:tcPr>
-            <w:tcW w:type="dxa" w:w="4703"/>
-          </w:tcPr>
-          <w:p>
-            <w:r>
-              <w:rPr>
-                <w:b/>
-                <w:sz w:val="20"/>
-              </w:rPr>
-              <w:t>Sisu</w:t>
-            </w:r>
-          </w:p>
-        </w:tc>
-      </w:tr>
-      <w:tr>
-        <w:tc>
-          <w:tcPr>
-            <w:tcW w:type="dxa" w:w="4703"/>
-          </w:tcPr>
-          <w:p>
-            <w:r>
-              <w:rPr>
-                <w:sz w:val="20"/>
-              </w:rPr>
-              <w:t>1. Nõusolek</w:t>
-            </w:r>
-          </w:p>
-        </w:tc>
-        <w:tc>
-          <w:tcPr>
-            <w:tcW w:type="dxa" w:w="4703"/>
-          </w:tcPr>
-          <w:p>
-            <w:r>
-              <w:rPr>
-                <w:sz w:val="20"/>
-              </w:rPr>
-              <w:t>Sa võid igal hetkel lõpetada</w:t>
-            </w:r>
-          </w:p>
-        </w:tc>
-      </w:tr>
-      <w:tr>
-        <w:tc>
-          <w:tcPr>
-            <w:tcW w:type="dxa" w:w="4703"/>
-          </w:tcPr>
-          <w:p>
-            <w:r>
-              <w:rPr>
-                <w:sz w:val="20"/>
-              </w:rPr>
-              <w:t>2. Üks eesmärk</w:t>
-            </w:r>
-          </w:p>
-        </w:tc>
-        <w:tc>
-          <w:tcPr>
-            <w:tcW w:type="dxa" w:w="4703"/>
-          </w:tcPr>
-          <w:p>
-            <w:r>
-              <w:rPr>
-                <w:sz w:val="20"/>
-              </w:rPr>
-              <w:t>Uni / rahunemine / fookus — mitte kõik korraga</w:t>
-            </w:r>
-          </w:p>
-        </w:tc>
-      </w:tr>
-      <w:tr>
-        <w:tc>
-          <w:tcPr>
-            <w:tcW w:type="dxa" w:w="4703"/>
-          </w:tcPr>
-          <w:p>
-            <w:r>
-              <w:rPr>
-                <w:sz w:val="20"/>
-              </w:rPr>
-              <w:t>3. Teadlikkus</w:t>
-            </w:r>
-          </w:p>
-        </w:tc>
-        <w:tc>
-          <w:tcPr>
-            <w:tcW w:type="dxa" w:w="4703"/>
-          </w:tcPr>
-          <w:p>
-            <w:r>
-              <w:rPr>
-                <w:sz w:val="20"/>
-              </w:rPr>
-              <w:t>Kuuled, tunned keha, saad silmad avada</w:t>
-            </w:r>
-          </w:p>
-        </w:tc>
-      </w:tr>
-      <w:tr>
-        <w:tc>
-          <w:tcPr>
-            <w:tcW w:type="dxa" w:w="4703"/>
-          </w:tcPr>
-          <w:p>
-            <w:r>
-              <w:rPr>
-                <w:sz w:val="20"/>
-              </w:rPr>
-              <w:t>4. STOP trauma/kriis</w:t>
-            </w:r>
-          </w:p>
-        </w:tc>
-        <w:tc>
-          <w:tcPr>
-            <w:tcW w:type="dxa" w:w="4703"/>
-          </w:tcPr>
-          <w:p>
-            <w:r>
-              <w:rPr>
-                <w:sz w:val="20"/>
-              </w:rPr>
-              <w:t>Raske minevik, dissotsiatsioon → mitte ise</w:t>
-            </w:r>
-          </w:p>
-        </w:tc>
-      </w:tr>
-      <w:tr>
-        <w:tc>
-          <w:tcPr>
-            <w:tcW w:type="dxa" w:w="4703"/>
-          </w:tcPr>
-          <w:p>
-            <w:r>
-              <w:rPr>
-                <w:sz w:val="20"/>
-              </w:rPr>
-              <w:t>5. Ei asenda arsti</w:t>
-            </w:r>
-          </w:p>
-        </w:tc>
-        <w:tc>
-          <w:tcPr>
-            <w:tcW w:type="dxa" w:w="4703"/>
-          </w:tcPr>
-          <w:p>
-            <w:r>
-              <w:rPr>
-                <w:sz w:val="20"/>
-              </w:rPr>
-              <w:t>Tõsine haigus vajab spetsialisti</w:t>
-            </w:r>
-          </w:p>
-        </w:tc>
-      </w:tr>
-      <w:tr>
-        <w:tc>
-          <w:tcPr>
-            <w:tcW w:type="dxa" w:w="4703"/>
-          </w:tcPr>
-          <w:p>
-            <w:r>
-              <w:rPr>
-                <w:sz w:val="20"/>
-              </w:rPr>
-              <w:t>6. Protokoll</w:t>
-            </w:r>
-          </w:p>
-        </w:tc>
-        <w:tc>
-          <w:tcPr>
-            <w:tcW w:type="dxa" w:w="4703"/>
-          </w:tcPr>
-          <w:p>
-            <w:r>
-              <w:rPr>
-                <w:sz w:val="20"/>
-              </w:rPr>
-              <w:t>1 lause: mis muutus? (debrief stiil)</w:t>
-            </w:r>
-          </w:p>
-        </w:tc>
-      </w:tr>
-    </w:tbl>
-    <w:p/>
     <w:p>
       <w:r>
         <w:rPr>
           <w:b/>
+          <w:i w:val="0"/>
           <w:sz w:val="22"/>
         </w:rPr>
-        <w:t>STOP — lõpeta kohe, kui:</w:t>
-      </w:r>
-    </w:p>
-    <w:p>
-      <w:pPr>
-        <w:pStyle w:val="ListBullet"/>
-      </w:pPr>
-      <w:r>
-        <w:t>distress &gt; 8/10 ja ei lange</w:t>
-      </w:r>
-    </w:p>
-    <w:p>
-      <w:pPr>
-        <w:pStyle w:val="ListBullet"/>
-      </w:pPr>
-      <w:r>
-        <w:t>tunned end õhust väljas</w:t>
-      </w:r>
-    </w:p>
-    <w:p>
-      <w:pPr>
-        <w:pStyle w:val="ListBullet"/>
-      </w:pPr>
-      <w:r>
-        <w:t>ülekoormav mälestus</w:t>
-      </w:r>
-    </w:p>
-    <w:p>
-      <w:pPr>
-        <w:pStyle w:val="ListBullet"/>
-      </w:pPr>
-      <w:r>
-        <w:t>paanika tugevneb</w:t>
+        <w:t>Samm 1: Ankur (2 min)</w:t>
       </w:r>
     </w:p>
     <w:p>
       <w:r>
         <w:rPr>
           <w:b w:val="0"/>
+          <w:i w:val="0"/>
           <w:sz w:val="22"/>
         </w:rPr>
-        <w:t>STOP tegevus: Ava silmad. Jalad põrandale. 5-4-3-2-1. Vesi. Kõnni. Spetsialist vajadusel.</w:t>
+        <w:t>3 hingetõmmet: sisse 4, välja 6.</w:t>
       </w:r>
     </w:p>
     <w:p>
-      <w:pPr>
-        <w:pStyle w:val="Heading2"/>
-      </w:pPr>
       <w:r>
         <w:rPr>
-          <w:color w:val="E65C00"/>
+          <w:b/>
+          <w:i w:val="0"/>
+          <w:sz w:val="22"/>
         </w:rPr>
-        <w:t>3. Kodune protokoll (15-25 min)</w:t>
+        <w:t>Samm 2: Keha skaneering (3 min)</w:t>
       </w:r>
     </w:p>
-    <w:tbl>
-      <w:tblPr>
-        <w:tblStyle w:val="TableGrid"/>
-        <w:tblW w:type="auto" w:w="0"/>
-        <w:tblLook w:firstColumn="1" w:firstRow="1" w:lastColumn="0" w:lastRow="0" w:noHBand="0" w:noVBand="1" w:val="04A0"/>
-      </w:tblPr>
-      <w:tblGrid>
-        <w:gridCol w:w="3135"/>
-        <w:gridCol w:w="3135"/>
-        <w:gridCol w:w="3135"/>
-      </w:tblGrid>
-      <w:tr>
-        <w:tc>
-          <w:tcPr>
-            <w:tcW w:type="dxa" w:w="3135"/>
-          </w:tcPr>
-          <w:p>
-            <w:r>
-              <w:rPr>
-                <w:b/>
-                <w:sz w:val="20"/>
-              </w:rPr>
-              <w:t>Samm</w:t>
-            </w:r>
-          </w:p>
-        </w:tc>
-        <w:tc>
-          <w:tcPr>
-            <w:tcW w:type="dxa" w:w="3135"/>
-          </w:tcPr>
-          <w:p>
-            <w:r>
-              <w:rPr>
-                <w:b/>
-                <w:sz w:val="20"/>
-              </w:rPr>
-              <w:t>Faas</w:t>
-            </w:r>
-          </w:p>
-        </w:tc>
-        <w:tc>
-          <w:tcPr>
-            <w:tcW w:type="dxa" w:w="3135"/>
-          </w:tcPr>
-          <w:p>
-            <w:r>
-              <w:rPr>
-                <w:b/>
-                <w:sz w:val="20"/>
-              </w:rPr>
-              <w:t>Aeg</w:t>
-            </w:r>
-          </w:p>
-        </w:tc>
-      </w:tr>
-      <w:tr>
-        <w:tc>
-          <w:tcPr>
-            <w:tcW w:type="dxa" w:w="3135"/>
-          </w:tcPr>
-          <w:p>
-            <w:r>
-              <w:rPr>
-                <w:sz w:val="20"/>
-              </w:rPr>
-              <w:t>0</w:t>
-            </w:r>
-          </w:p>
-        </w:tc>
-        <w:tc>
-          <w:tcPr>
-            <w:tcW w:type="dxa" w:w="3135"/>
-          </w:tcPr>
-          <w:p>
-            <w:r>
-              <w:rPr>
-                <w:sz w:val="20"/>
-              </w:rPr>
-              <w:t>Valmistumine — vaikne koht, vesi, üks eesmärk, stress 0-10</w:t>
-            </w:r>
-          </w:p>
-        </w:tc>
-        <w:tc>
-          <w:tcPr>
-            <w:tcW w:type="dxa" w:w="3135"/>
-          </w:tcPr>
-          <w:p>
-            <w:r>
-              <w:rPr>
-                <w:sz w:val="20"/>
-              </w:rPr>
-              <w:t>2 min</w:t>
-            </w:r>
-          </w:p>
-        </w:tc>
-      </w:tr>
-      <w:tr>
-        <w:tc>
-          <w:tcPr>
-            <w:tcW w:type="dxa" w:w="3135"/>
-          </w:tcPr>
-          <w:p>
-            <w:r>
-              <w:rPr>
-                <w:sz w:val="20"/>
-              </w:rPr>
-              <w:t>1</w:t>
-            </w:r>
-          </w:p>
-        </w:tc>
-        <w:tc>
-          <w:tcPr>
-            <w:tcW w:type="dxa" w:w="3135"/>
-          </w:tcPr>
-          <w:p>
-            <w:r>
-              <w:rPr>
-                <w:sz w:val="20"/>
-              </w:rPr>
-              <w:t>Ankur — hingamine sisse 4, välja 6 × 3</w:t>
-            </w:r>
-          </w:p>
-        </w:tc>
-        <w:tc>
-          <w:tcPr>
-            <w:tcW w:type="dxa" w:w="3135"/>
-          </w:tcPr>
-          <w:p>
-            <w:r>
-              <w:rPr>
-                <w:sz w:val="20"/>
-              </w:rPr>
-              <w:t>2 min</w:t>
-            </w:r>
-          </w:p>
-        </w:tc>
-      </w:tr>
-      <w:tr>
-        <w:tc>
-          <w:tcPr>
-            <w:tcW w:type="dxa" w:w="3135"/>
-          </w:tcPr>
-          <w:p>
-            <w:r>
-              <w:rPr>
-                <w:sz w:val="20"/>
-              </w:rPr>
-              <w:t>2</w:t>
-            </w:r>
-          </w:p>
-        </w:tc>
-        <w:tc>
-          <w:tcPr>
-            <w:tcW w:type="dxa" w:w="3135"/>
-          </w:tcPr>
-          <w:p>
-            <w:r>
-              <w:rPr>
-                <w:sz w:val="20"/>
-              </w:rPr>
-              <w:t>Keha skaneering — peast jalgadeni</w:t>
-            </w:r>
-          </w:p>
-        </w:tc>
-        <w:tc>
-          <w:tcPr>
-            <w:tcW w:type="dxa" w:w="3135"/>
-          </w:tcPr>
-          <w:p>
-            <w:r>
-              <w:rPr>
-                <w:sz w:val="20"/>
-              </w:rPr>
-              <w:t>3 min</w:t>
-            </w:r>
-          </w:p>
-        </w:tc>
-      </w:tr>
-      <w:tr>
-        <w:tc>
-          <w:tcPr>
-            <w:tcW w:type="dxa" w:w="3135"/>
-          </w:tcPr>
-          <w:p>
-            <w:r>
-              <w:rPr>
-                <w:sz w:val="20"/>
-              </w:rPr>
-              <w:t>3</w:t>
-            </w:r>
-          </w:p>
-        </w:tc>
-        <w:tc>
-          <w:tcPr>
-            <w:tcW w:type="dxa" w:w="3135"/>
-          </w:tcPr>
-          <w:p>
-            <w:r>
-              <w:rPr>
-                <w:sz w:val="20"/>
-              </w:rPr>
-              <w:t>Turvakoht — kujutle turvalist kohta</w:t>
-            </w:r>
-          </w:p>
-        </w:tc>
-        <w:tc>
-          <w:tcPr>
-            <w:tcW w:type="dxa" w:w="3135"/>
-          </w:tcPr>
-          <w:p>
-            <w:r>
-              <w:rPr>
-                <w:sz w:val="20"/>
-              </w:rPr>
-              <w:t>2 min</w:t>
-            </w:r>
-          </w:p>
-        </w:tc>
-      </w:tr>
-      <w:tr>
-        <w:tc>
-          <w:tcPr>
-            <w:tcW w:type="dxa" w:w="3135"/>
-          </w:tcPr>
-          <w:p>
-            <w:r>
-              <w:rPr>
-                <w:sz w:val="20"/>
-              </w:rPr>
-              <w:t>4</w:t>
-            </w:r>
-          </w:p>
-        </w:tc>
-        <w:tc>
-          <w:tcPr>
-            <w:tcW w:type="dxa" w:w="3135"/>
-          </w:tcPr>
-          <w:p>
-            <w:r>
-              <w:rPr>
-                <w:sz w:val="20"/>
-              </w:rPr>
-              <w:t>Suggestioon — HY1 lause 8-12 min</w:t>
-            </w:r>
-          </w:p>
-        </w:tc>
-        <w:tc>
-          <w:tcPr>
-            <w:tcW w:type="dxa" w:w="3135"/>
-          </w:tcPr>
-          <w:p>
-            <w:r>
-              <w:rPr>
-                <w:sz w:val="20"/>
-              </w:rPr>
-              <w:t>8-12 min</w:t>
-            </w:r>
-          </w:p>
-        </w:tc>
-      </w:tr>
-      <w:tr>
-        <w:tc>
-          <w:tcPr>
-            <w:tcW w:type="dxa" w:w="3135"/>
-          </w:tcPr>
-          <w:p>
-            <w:r>
-              <w:rPr>
-                <w:sz w:val="20"/>
-              </w:rPr>
-              <w:t>5</w:t>
-            </w:r>
-          </w:p>
-        </w:tc>
-        <w:tc>
-          <w:tcPr>
-            <w:tcW w:type="dxa" w:w="3135"/>
-          </w:tcPr>
-          <w:p>
-            <w:r>
-              <w:rPr>
-                <w:sz w:val="20"/>
-              </w:rPr>
-              <w:t>Tagasitulek — loenda 5-1, ava silmad</w:t>
-            </w:r>
-          </w:p>
-        </w:tc>
-        <w:tc>
-          <w:tcPr>
-            <w:tcW w:type="dxa" w:w="3135"/>
-          </w:tcPr>
-          <w:p>
-            <w:r>
-              <w:rPr>
-                <w:sz w:val="20"/>
-              </w:rPr>
-              <w:t>2 min</w:t>
-            </w:r>
-          </w:p>
-        </w:tc>
-      </w:tr>
-      <w:tr>
-        <w:tc>
-          <w:tcPr>
-            <w:tcW w:type="dxa" w:w="3135"/>
-          </w:tcPr>
-          <w:p>
-            <w:r>
-              <w:rPr>
-                <w:sz w:val="20"/>
-              </w:rPr>
-              <w:t>6</w:t>
-            </w:r>
-          </w:p>
-        </w:tc>
-        <w:tc>
-          <w:tcPr>
-            <w:tcW w:type="dxa" w:w="3135"/>
-          </w:tcPr>
-          <w:p>
-            <w:r>
-              <w:rPr>
-                <w:sz w:val="20"/>
-              </w:rPr>
-              <w:t>Integratsioon — mis muutus?</w:t>
-            </w:r>
-          </w:p>
-        </w:tc>
-        <w:tc>
-          <w:tcPr>
-            <w:tcW w:type="dxa" w:w="3135"/>
-          </w:tcPr>
-          <w:p>
-            <w:r>
-              <w:rPr>
-                <w:sz w:val="20"/>
-              </w:rPr>
-              <w:t>1 min</w:t>
-            </w:r>
-          </w:p>
-        </w:tc>
-      </w:tr>
-    </w:tbl>
-    <w:p/>
+    <w:p>
+      <w:r>
+        <w:rPr>
+          <w:b w:val="0"/>
+          <w:i w:val="0"/>
+          <w:sz w:val="22"/>
+        </w:rPr>
+        <w:t>Tähelepanu peast jalgadeni. Igas kohas: Lõdvestu.</w:t>
+      </w:r>
+    </w:p>
+    <w:p>
+      <w:r>
+        <w:rPr>
+          <w:b/>
+          <w:i w:val="0"/>
+          <w:sz w:val="22"/>
+        </w:rPr>
+        <w:t>Samm 3: Turvakoht (2 min)</w:t>
+      </w:r>
+    </w:p>
+    <w:p>
+      <w:r>
+        <w:rPr>
+          <w:b w:val="0"/>
+          <w:i w:val="0"/>
+          <w:sz w:val="22"/>
+        </w:rPr>
+        <w:t>Kujutle turvalist kohta. Mida näed, kuuled, tunned?</w:t>
+      </w:r>
+    </w:p>
+    <w:p>
+      <w:r>
+        <w:rPr>
+          <w:b/>
+          <w:i w:val="0"/>
+          <w:sz w:val="22"/>
+        </w:rPr>
+        <w:t>Samm 4: Suggestioon (8–12 min)</w:t>
+      </w:r>
+    </w:p>
+    <w:p>
+      <w:r>
+        <w:rPr>
+          <w:b w:val="0"/>
+          <w:i w:val="0"/>
+          <w:sz w:val="22"/>
+        </w:rPr>
+        <w:t>Too eesmärk meelde. Loe HY1 lauset.</w:t>
+      </w:r>
+    </w:p>
+    <w:p>
+      <w:r>
+        <w:rPr>
+          <w:b/>
+          <w:i w:val="0"/>
+          <w:sz w:val="22"/>
+        </w:rPr>
+        <w:t>Samm 5: Lõpeta</w:t>
+      </w:r>
+    </w:p>
+    <w:p>
+      <w:r>
+        <w:rPr>
+          <w:b w:val="0"/>
+          <w:i w:val="0"/>
+          <w:sz w:val="22"/>
+        </w:rPr>
+        <w:t>Loenda 5-1. Ava silmad. Vesi. Mis muutus?</w:t>
+      </w:r>
+    </w:p>
     <w:p>
       <w:pPr>
         <w:ind w:left="567"/>
@@ -1121,13 +338,103 @@
     </w:p>
     <w:p>
       <w:pPr>
-        <w:pStyle w:val="Heading2"/>
+        <w:pStyle w:val="Heading1"/>
       </w:pPr>
       <w:r>
         <w:rPr>
-          <w:color w:val="E65C00"/>
+          <w:color w:val="1B5E20"/>
         </w:rPr>
-        <w:t>4. Millal spetsialist</w:t>
+        <w:t>4. Paarilisele — kuidas aidata</w:t>
+      </w:r>
+    </w:p>
+    <w:p>
+      <w:r>
+        <w:rPr>
+          <w:b/>
+          <w:i w:val="0"/>
+          <w:sz w:val="22"/>
+        </w:rPr>
+        <w:t>Sa ei pea olema terapeut. Sa juhid rütmi ja hoiad ruumi turvalisena.</w:t>
+      </w:r>
+    </w:p>
+    <w:p>
+      <w:r>
+        <w:rPr>
+          <w:b w:val="0"/>
+          <w:i/>
+          <w:sz w:val="22"/>
+        </w:rPr>
+        <w:t>Enne algust: Sul on alati kontroll. Ava silmad igal hetkel.</w:t>
+      </w:r>
+    </w:p>
+    <w:p>
+      <w:r>
+        <w:rPr>
+          <w:b/>
+          <w:i w:val="0"/>
+          <w:sz w:val="22"/>
+        </w:rPr>
+        <w:t>Paariline protokoll:</w:t>
+      </w:r>
+    </w:p>
+    <w:p>
+      <w:r>
+        <w:rPr>
+          <w:b w:val="0"/>
+          <w:i w:val="0"/>
+          <w:sz w:val="22"/>
+        </w:rPr>
+        <w:t>1. Lepi kokku: üks eesmärk, 15–25 min.</w:t>
+      </w:r>
+    </w:p>
+    <w:p>
+      <w:r>
+        <w:rPr>
+          <w:b w:val="0"/>
+          <w:i w:val="0"/>
+          <w:sz w:val="22"/>
+        </w:rPr>
+        <w:t>2. A kuulab. B loeb skripti aeglaselt.</w:t>
+      </w:r>
+    </w:p>
+    <w:p>
+      <w:r>
+        <w:rPr>
+          <w:b w:val="0"/>
+          <w:i w:val="0"/>
+          <w:sz w:val="22"/>
+        </w:rPr>
+        <w:t>3. Ankur → keha → turvakoht → suggestioon 8–12 min.</w:t>
+      </w:r>
+    </w:p>
+    <w:p>
+      <w:r>
+        <w:rPr>
+          <w:b w:val="0"/>
+          <w:i w:val="0"/>
+          <w:sz w:val="22"/>
+        </w:rPr>
+        <w:t>4. Loendame 5-1. Ava silmad. Distress? Mis muutus?</w:t>
+      </w:r>
+    </w:p>
+    <w:p>
+      <w:r>
+        <w:rPr>
+          <w:b w:val="0"/>
+          <w:i w:val="0"/>
+          <w:sz w:val="22"/>
+        </w:rPr>
+        <w:t>5. Vaheta rolid järgmisel korral.</w:t>
+      </w:r>
+    </w:p>
+    <w:p>
+      <w:r>
+        <w:rPr>
+          <w:b/>
+          <w:i w:val="0"/>
+          <w:sz w:val="22"/>
+        </w:rPr>
+        <w:t>Mida abiline EI tee:</w:t>
       </w:r>
     </w:p>
     <w:p>
@@ -1135,7 +442,7 @@
         <w:pStyle w:val="ListBullet"/>
       </w:pPr>
       <w:r>
-        <w:t>PTSD, raske trauma, dissotsiatsioon</w:t>
+        <w:t>Ei analüüsi ega anna nõu.</w:t>
       </w:r>
     </w:p>
     <w:p>
@@ -1143,7 +450,7 @@
         <w:pStyle w:val="ListBullet"/>
       </w:pPr>
       <w:r>
-        <w:t>Depressioon, paanikahäired, krooniline unetus</w:t>
+        <w:t>Ei suru rääkima.</w:t>
       </w:r>
     </w:p>
     <w:p>
@@ -1151,7 +458,7 @@
         <w:pStyle w:val="ListBullet"/>
       </w:pPr>
       <w:r>
-        <w:t>Tugev sõltuvus (suitsetamine, alkohol)</w:t>
+        <w:t>Ei jätka, kui partner ütleb stop.</w:t>
       </w:r>
     </w:p>
     <w:p>
@@ -1159,12 +466,7 @@
         <w:pStyle w:val="ListBullet"/>
       </w:pPr>
       <w:r>
-        <w:t>Laste hüpnoos ilma lapsepsühholoogi taustata</w:t>
-      </w:r>
-    </w:p>
-    <w:p>
-      <w:r>
-        <w:br w:type="page"/>
+        <w:t>Ei ütle sa oled hüpnoosis ja ei mäleta.</w:t>
       </w:r>
     </w:p>
     <w:p>
@@ -1175,775 +477,41 @@
         <w:rPr>
           <w:color w:val="1B5E20"/>
         </w:rPr>
-        <w:t>OSA 2 — Koolituskaart HY1</w:t>
+        <w:t>5. Millal STOP</w:t>
       </w:r>
     </w:p>
     <w:p>
+      <w:pPr>
+        <w:pStyle w:val="ListBullet"/>
+      </w:pPr>
       <w:r>
-        <w:rPr>
-          <w:b/>
-          <w:sz w:val="20"/>
-        </w:rPr>
-        <w:t>Prindi see osa eraldi — taskus või külmkapis.</w:t>
+        <w:t>Distress üle 8/10</w:t>
       </w:r>
     </w:p>
-    <w:tbl>
-      <w:tblPr>
-        <w:tblStyle w:val="TableGrid"/>
-        <w:tblW w:type="auto" w:w="0"/>
-        <w:tblLook w:firstColumn="1" w:firstRow="1" w:lastColumn="0" w:lastRow="0" w:noHBand="0" w:noVBand="1" w:val="04A0"/>
-      </w:tblPr>
-      <w:tblGrid>
-        <w:gridCol w:w="4703"/>
-        <w:gridCol w:w="4703"/>
-      </w:tblGrid>
-      <w:tr>
-        <w:tc>
-          <w:tcPr>
-            <w:tcW w:type="dxa" w:w="4703"/>
-          </w:tcPr>
-          <w:p>
-            <w:r>
-              <w:rPr>
-                <w:b/>
-                <w:sz w:val="20"/>
-              </w:rPr>
-              <w:t>Vali</w:t>
-            </w:r>
-          </w:p>
-        </w:tc>
-        <w:tc>
-          <w:tcPr>
-            <w:tcW w:type="dxa" w:w="4703"/>
-          </w:tcPr>
-          <w:p>
-            <w:r>
-              <w:rPr>
-                <w:b/>
-                <w:sz w:val="20"/>
-              </w:rPr>
-              <w:t>Sisu</w:t>
-            </w:r>
-          </w:p>
-        </w:tc>
-      </w:tr>
-      <w:tr>
-        <w:tc>
-          <w:tcPr>
-            <w:tcW w:type="dxa" w:w="4703"/>
-          </w:tcPr>
-          <w:p>
-            <w:r>
-              <w:rPr>
-                <w:sz w:val="20"/>
-              </w:rPr>
-              <w:t>OLULINE</w:t>
-            </w:r>
-          </w:p>
-        </w:tc>
-        <w:tc>
-          <w:tcPr>
-            <w:tcW w:type="dxa" w:w="4703"/>
-          </w:tcPr>
-          <w:p>
-            <w:r>
-              <w:rPr>
-                <w:sz w:val="20"/>
-              </w:rPr>
-              <w:t>Kerge stress/uni/fookus — MITTE trauma/PTSD/kriis</w:t>
-            </w:r>
-          </w:p>
-        </w:tc>
-      </w:tr>
-      <w:tr>
-        <w:tc>
-          <w:tcPr>
-            <w:tcW w:type="dxa" w:w="4703"/>
-          </w:tcPr>
-          <w:p>
-            <w:r>
-              <w:rPr>
-                <w:sz w:val="20"/>
-              </w:rPr>
-              <w:t>Kontroll</w:t>
-            </w:r>
-          </w:p>
-        </w:tc>
-        <w:tc>
-          <w:tcPr>
-            <w:tcW w:type="dxa" w:w="4703"/>
-          </w:tcPr>
-          <w:p>
-            <w:r>
-              <w:rPr>
-                <w:sz w:val="20"/>
-              </w:rPr>
-              <w:t>Sa SAAD igal hetkel silmad avada</w:t>
-            </w:r>
-          </w:p>
-        </w:tc>
-      </w:tr>
-      <w:tr>
-        <w:tc>
-          <w:tcPr>
-            <w:tcW w:type="dxa" w:w="4703"/>
-          </w:tcPr>
-          <w:p>
-            <w:r>
-              <w:rPr>
-                <w:sz w:val="20"/>
-              </w:rPr>
-              <w:t>STOP</w:t>
-            </w:r>
-          </w:p>
-        </w:tc>
-        <w:tc>
-          <w:tcPr>
-            <w:tcW w:type="dxa" w:w="4703"/>
-          </w:tcPr>
-          <w:p>
-            <w:r>
-              <w:rPr>
-                <w:sz w:val="20"/>
-              </w:rPr>
-              <w:t>Distress &gt; 8/10 või õhust väljas → lõpeta</w:t>
-            </w:r>
-          </w:p>
-        </w:tc>
-      </w:tr>
-    </w:tbl>
-    <w:p/>
     <w:p>
       <w:pPr>
-        <w:pStyle w:val="Heading2"/>
+        <w:pStyle w:val="ListBullet"/>
       </w:pPr>
       <w:r>
-        <w:rPr>
-          <w:color w:val="E65C00"/>
-        </w:rPr>
-        <w:t>Protsess (kiire viide)</w:t>
+        <w:t>Pearinglus, paanika, dissotsiatsioon</w:t>
+      </w:r>
+    </w:p>
+    <w:p>
+      <w:pPr>
+        <w:pStyle w:val="ListBullet"/>
+      </w:pPr>
+      <w:r>
+        <w:t>Tugevad flashback'id</w:t>
       </w:r>
     </w:p>
     <w:p>
       <w:r>
         <w:rPr>
           <w:b w:val="0"/>
+          <w:i w:val="0"/>
           <w:sz w:val="22"/>
         </w:rPr>
-        <w:t>Ankur → Keha skaneering → Turvakoht → Suggestioon 8-12 min → Tagasi 5-1 → Vesi → Mis muutus?</w:t>
-      </w:r>
-    </w:p>
-    <w:p>
-      <w:pPr>
-        <w:pStyle w:val="Heading2"/>
-      </w:pPr>
-      <w:r>
-        <w:rPr>
-          <w:color w:val="E65C00"/>
-        </w:rPr>
-        <w:t>Eesmärk (vali ÜKS)</w:t>
-      </w:r>
-    </w:p>
-    <w:tbl>
-      <w:tblPr>
-        <w:tblStyle w:val="TableGrid"/>
-        <w:tblW w:type="auto" w:w="0"/>
-        <w:tblLook w:firstColumn="1" w:firstRow="1" w:lastColumn="0" w:lastRow="0" w:noHBand="0" w:noVBand="1" w:val="04A0"/>
-      </w:tblPr>
-      <w:tblGrid>
-        <w:gridCol w:w="4703"/>
-        <w:gridCol w:w="4703"/>
-      </w:tblGrid>
-      <w:tr>
-        <w:tc>
-          <w:tcPr>
-            <w:tcW w:type="dxa" w:w="4703"/>
-          </w:tcPr>
-          <w:p>
-            <w:r>
-              <w:rPr>
-                <w:b/>
-                <w:sz w:val="20"/>
-              </w:rPr>
-              <w:t>Variant</w:t>
-            </w:r>
-          </w:p>
-        </w:tc>
-        <w:tc>
-          <w:tcPr>
-            <w:tcW w:type="dxa" w:w="4703"/>
-          </w:tcPr>
-          <w:p>
-            <w:r>
-              <w:rPr>
-                <w:b/>
-                <w:sz w:val="20"/>
-              </w:rPr>
-              <w:t>Valitud (märgi X)</w:t>
-            </w:r>
-          </w:p>
-        </w:tc>
-      </w:tr>
-      <w:tr>
-        <w:tc>
-          <w:tcPr>
-            <w:tcW w:type="dxa" w:w="4703"/>
-          </w:tcPr>
-          <w:p>
-            <w:r>
-              <w:rPr>
-                <w:sz w:val="20"/>
-              </w:rPr>
-              <w:t>Rahunemine</w:t>
-            </w:r>
-          </w:p>
-        </w:tc>
-        <w:tc>
-          <w:tcPr>
-            <w:tcW w:type="dxa" w:w="4703"/>
-          </w:tcPr>
-          <w:p>
-            <w:r>
-              <w:rPr>
-                <w:sz w:val="20"/>
-              </w:rPr>
-              <w:t>[ ]</w:t>
-            </w:r>
-          </w:p>
-        </w:tc>
-      </w:tr>
-      <w:tr>
-        <w:tc>
-          <w:tcPr>
-            <w:tcW w:type="dxa" w:w="4703"/>
-          </w:tcPr>
-          <w:p>
-            <w:r>
-              <w:rPr>
-                <w:sz w:val="20"/>
-              </w:rPr>
-              <w:t>Uni</w:t>
-            </w:r>
-          </w:p>
-        </w:tc>
-        <w:tc>
-          <w:tcPr>
-            <w:tcW w:type="dxa" w:w="4703"/>
-          </w:tcPr>
-          <w:p>
-            <w:r>
-              <w:rPr>
-                <w:sz w:val="20"/>
-              </w:rPr>
-              <w:t>[ ]</w:t>
-            </w:r>
-          </w:p>
-        </w:tc>
-      </w:tr>
-      <w:tr>
-        <w:tc>
-          <w:tcPr>
-            <w:tcW w:type="dxa" w:w="4703"/>
-          </w:tcPr>
-          <w:p>
-            <w:r>
-              <w:rPr>
-                <w:sz w:val="20"/>
-              </w:rPr>
-              <w:t>Fookus enne tegevust</w:t>
-            </w:r>
-          </w:p>
-        </w:tc>
-        <w:tc>
-          <w:tcPr>
-            <w:tcW w:type="dxa" w:w="4703"/>
-          </w:tcPr>
-          <w:p>
-            <w:r>
-              <w:rPr>
-                <w:sz w:val="20"/>
-              </w:rPr>
-              <w:t>[ ]</w:t>
-            </w:r>
-          </w:p>
-        </w:tc>
-      </w:tr>
-      <w:tr>
-        <w:tc>
-          <w:tcPr>
-            <w:tcW w:type="dxa" w:w="4703"/>
-          </w:tcPr>
-          <w:p>
-            <w:r>
-              <w:rPr>
-                <w:sz w:val="20"/>
-              </w:rPr>
-              <w:t>Debriefi ettevalmistus (5 min)</w:t>
-            </w:r>
-          </w:p>
-        </w:tc>
-        <w:tc>
-          <w:tcPr>
-            <w:tcW w:type="dxa" w:w="4703"/>
-          </w:tcPr>
-          <w:p>
-            <w:r>
-              <w:rPr>
-                <w:sz w:val="20"/>
-              </w:rPr>
-              <w:t>[ ]</w:t>
-            </w:r>
-          </w:p>
-        </w:tc>
-      </w:tr>
-    </w:tbl>
-    <w:p/>
-    <w:tbl>
-      <w:tblPr>
-        <w:tblStyle w:val="TableGrid"/>
-        <w:tblW w:type="auto" w:w="0"/>
-        <w:tblLook w:firstColumn="1" w:firstRow="1" w:lastColumn="0" w:lastRow="0" w:noHBand="0" w:noVBand="1" w:val="04A0"/>
-      </w:tblPr>
-      <w:tblGrid>
-        <w:gridCol w:w="4703"/>
-        <w:gridCol w:w="4703"/>
-      </w:tblGrid>
-      <w:tr>
-        <w:tc>
-          <w:tcPr>
-            <w:tcW w:type="dxa" w:w="4703"/>
-          </w:tcPr>
-          <w:p>
-            <w:r>
-              <w:rPr>
-                <w:b/>
-                <w:sz w:val="20"/>
-              </w:rPr>
-              <w:t>KEELATUD</w:t>
-            </w:r>
-          </w:p>
-        </w:tc>
-        <w:tc>
-          <w:tcPr>
-            <w:tcW w:type="dxa" w:w="4703"/>
-          </w:tcPr>
-          <w:p>
-            <w:r>
-              <w:rPr>
-                <w:b/>
-                <w:sz w:val="20"/>
-              </w:rPr>
-              <w:t>KOHUSTUSLIK</w:t>
-            </w:r>
-          </w:p>
-        </w:tc>
-      </w:tr>
-      <w:tr>
-        <w:tc>
-          <w:tcPr>
-            <w:tcW w:type="dxa" w:w="4703"/>
-          </w:tcPr>
-          <w:p>
-            <w:r>
-              <w:rPr>
-                <w:sz w:val="20"/>
-              </w:rPr>
-              <w:t>Trauma avamine ilma oskuseta</w:t>
-            </w:r>
-          </w:p>
-        </w:tc>
-        <w:tc>
-          <w:tcPr>
-            <w:tcW w:type="dxa" w:w="4703"/>
-          </w:tcPr>
-          <w:p>
-            <w:r>
-              <w:rPr>
-                <w:sz w:val="20"/>
-              </w:rPr>
-              <w:t>Üks eesmärk korraga</w:t>
-            </w:r>
-          </w:p>
-        </w:tc>
-      </w:tr>
-      <w:tr>
-        <w:tc>
-          <w:tcPr>
-            <w:tcW w:type="dxa" w:w="4703"/>
-          </w:tcPr>
-          <w:p>
-            <w:r>
-              <w:rPr>
-                <w:sz w:val="20"/>
-              </w:rPr>
-              <w:t>Sund / sa ei mäleta</w:t>
-            </w:r>
-          </w:p>
-        </w:tc>
-        <w:tc>
-          <w:tcPr>
-            <w:tcW w:type="dxa" w:w="4703"/>
-          </w:tcPr>
-          <w:p>
-            <w:r>
-              <w:rPr>
-                <w:sz w:val="20"/>
-              </w:rPr>
-              <w:t>Nõusolek enne alustamist</w:t>
-            </w:r>
-          </w:p>
-        </w:tc>
-      </w:tr>
-      <w:tr>
-        <w:tc>
-          <w:tcPr>
-            <w:tcW w:type="dxa" w:w="4703"/>
-          </w:tcPr>
-          <w:p>
-            <w:r>
-              <w:rPr>
-                <w:sz w:val="20"/>
-              </w:rPr>
-              <w:t>Diagnoosimine</w:t>
-            </w:r>
-          </w:p>
-        </w:tc>
-        <w:tc>
-          <w:tcPr>
-            <w:tcW w:type="dxa" w:w="4703"/>
-          </w:tcPr>
-          <w:p>
-            <w:r>
-              <w:rPr>
-                <w:sz w:val="20"/>
-              </w:rPr>
-              <w:t>1 lause integratsioon/debrief</w:t>
-            </w:r>
-          </w:p>
-        </w:tc>
-      </w:tr>
-    </w:tbl>
-    <w:p/>
-    <w:p>
-      <w:pPr>
-        <w:pStyle w:val="Heading2"/>
-      </w:pPr>
-      <w:r>
-        <w:rPr>
-          <w:color w:val="E65C00"/>
-        </w:rPr>
-        <w:t>Eneserefleksioon</w:t>
-      </w:r>
-    </w:p>
-    <w:tbl>
-      <w:tblPr>
-        <w:tblStyle w:val="TableGrid"/>
-        <w:tblW w:type="auto" w:w="0"/>
-        <w:tblLook w:firstColumn="1" w:firstRow="1" w:lastColumn="0" w:lastRow="0" w:noHBand="0" w:noVBand="1" w:val="04A0"/>
-      </w:tblPr>
-      <w:tblGrid>
-        <w:gridCol w:w="2351"/>
-        <w:gridCol w:w="2351"/>
-        <w:gridCol w:w="2351"/>
-        <w:gridCol w:w="2351"/>
-      </w:tblGrid>
-      <w:tr>
-        <w:tc>
-          <w:tcPr>
-            <w:tcW w:type="dxa" w:w="2351"/>
-          </w:tcPr>
-          <w:p>
-            <w:r>
-              <w:rPr>
-                <w:b/>
-                <w:sz w:val="20"/>
-              </w:rPr>
-              <w:t>Küsimus</w:t>
-            </w:r>
-          </w:p>
-        </w:tc>
-        <w:tc>
-          <w:tcPr>
-            <w:tcW w:type="dxa" w:w="2351"/>
-          </w:tcPr>
-          <w:p>
-            <w:r>
-              <w:rPr>
-                <w:b/>
-                <w:sz w:val="20"/>
-              </w:rPr>
-              <w:t>Jah</w:t>
-            </w:r>
-          </w:p>
-        </w:tc>
-        <w:tc>
-          <w:tcPr>
-            <w:tcW w:type="dxa" w:w="2351"/>
-          </w:tcPr>
-          <w:p>
-            <w:r>
-              <w:rPr>
-                <w:b/>
-                <w:sz w:val="20"/>
-              </w:rPr>
-              <w:t>Osaliselt</w:t>
-            </w:r>
-          </w:p>
-        </w:tc>
-        <w:tc>
-          <w:tcPr>
-            <w:tcW w:type="dxa" w:w="2351"/>
-          </w:tcPr>
-          <w:p>
-            <w:r>
-              <w:rPr>
-                <w:b/>
-                <w:sz w:val="20"/>
-              </w:rPr>
-              <w:t>Ei</w:t>
-            </w:r>
-          </w:p>
-        </w:tc>
-      </w:tr>
-      <w:tr>
-        <w:tc>
-          <w:tcPr>
-            <w:tcW w:type="dxa" w:w="2351"/>
-          </w:tcPr>
-          <w:p>
-            <w:r>
-              <w:rPr>
-                <w:sz w:val="20"/>
-              </w:rPr>
-              <w:t>Sain valida ühe selge eesmärgi?</w:t>
-            </w:r>
-          </w:p>
-        </w:tc>
-        <w:tc>
-          <w:tcPr>
-            <w:tcW w:type="dxa" w:w="2351"/>
-          </w:tcPr>
-          <w:p>
-            <w:r>
-              <w:rPr>
-                <w:sz w:val="20"/>
-              </w:rPr>
-              <w:t>[ ]</w:t>
-            </w:r>
-          </w:p>
-        </w:tc>
-        <w:tc>
-          <w:tcPr>
-            <w:tcW w:type="dxa" w:w="2351"/>
-          </w:tcPr>
-          <w:p>
-            <w:r>
-              <w:rPr>
-                <w:sz w:val="20"/>
-              </w:rPr>
-              <w:t>[ ]</w:t>
-            </w:r>
-          </w:p>
-        </w:tc>
-        <w:tc>
-          <w:tcPr>
-            <w:tcW w:type="dxa" w:w="2351"/>
-          </w:tcPr>
-          <w:p>
-            <w:r>
-              <w:rPr>
-                <w:sz w:val="20"/>
-              </w:rPr>
-              <w:t>[ ]</w:t>
-            </w:r>
-          </w:p>
-        </w:tc>
-      </w:tr>
-      <w:tr>
-        <w:tc>
-          <w:tcPr>
-            <w:tcW w:type="dxa" w:w="2351"/>
-          </w:tcPr>
-          <w:p>
-            <w:r>
-              <w:rPr>
-                <w:sz w:val="20"/>
-              </w:rPr>
-              <w:t>Sain igal hetkel lõpetada?</w:t>
-            </w:r>
-          </w:p>
-        </w:tc>
-        <w:tc>
-          <w:tcPr>
-            <w:tcW w:type="dxa" w:w="2351"/>
-          </w:tcPr>
-          <w:p>
-            <w:r>
-              <w:rPr>
-                <w:sz w:val="20"/>
-              </w:rPr>
-              <w:t>[ ]</w:t>
-            </w:r>
-          </w:p>
-        </w:tc>
-        <w:tc>
-          <w:tcPr>
-            <w:tcW w:type="dxa" w:w="2351"/>
-          </w:tcPr>
-          <w:p>
-            <w:r>
-              <w:rPr>
-                <w:sz w:val="20"/>
-              </w:rPr>
-              <w:t>[ ]</w:t>
-            </w:r>
-          </w:p>
-        </w:tc>
-        <w:tc>
-          <w:tcPr>
-            <w:tcW w:type="dxa" w:w="2351"/>
-          </w:tcPr>
-          <w:p>
-            <w:r>
-              <w:rPr>
-                <w:sz w:val="20"/>
-              </w:rPr>
-              <w:t>[ ]</w:t>
-            </w:r>
-          </w:p>
-        </w:tc>
-      </w:tr>
-      <w:tr>
-        <w:tc>
-          <w:tcPr>
-            <w:tcW w:type="dxa" w:w="2351"/>
-          </w:tcPr>
-          <w:p>
-            <w:r>
-              <w:rPr>
-                <w:sz w:val="20"/>
-              </w:rPr>
-              <w:t>Stress/distress langes?</w:t>
-            </w:r>
-          </w:p>
-        </w:tc>
-        <w:tc>
-          <w:tcPr>
-            <w:tcW w:type="dxa" w:w="2351"/>
-          </w:tcPr>
-          <w:p>
-            <w:r>
-              <w:rPr>
-                <w:sz w:val="20"/>
-              </w:rPr>
-              <w:t>[ ]</w:t>
-            </w:r>
-          </w:p>
-        </w:tc>
-        <w:tc>
-          <w:tcPr>
-            <w:tcW w:type="dxa" w:w="2351"/>
-          </w:tcPr>
-          <w:p>
-            <w:r>
-              <w:rPr>
-                <w:sz w:val="20"/>
-              </w:rPr>
-              <w:t>[ ]</w:t>
-            </w:r>
-          </w:p>
-        </w:tc>
-        <w:tc>
-          <w:tcPr>
-            <w:tcW w:type="dxa" w:w="2351"/>
-          </w:tcPr>
-          <w:p>
-            <w:r>
-              <w:rPr>
-                <w:sz w:val="20"/>
-              </w:rPr>
-              <w:t>[ ]</w:t>
-            </w:r>
-          </w:p>
-        </w:tc>
-      </w:tr>
-      <w:tr>
-        <w:tc>
-          <w:tcPr>
-            <w:tcW w:type="dxa" w:w="2351"/>
-          </w:tcPr>
-          <w:p>
-            <w:r>
-              <w:rPr>
-                <w:sz w:val="20"/>
-              </w:rPr>
-              <w:t>Kirjutasin mis muutus?</w:t>
-            </w:r>
-          </w:p>
-        </w:tc>
-        <w:tc>
-          <w:tcPr>
-            <w:tcW w:type="dxa" w:w="2351"/>
-          </w:tcPr>
-          <w:p>
-            <w:r>
-              <w:rPr>
-                <w:sz w:val="20"/>
-              </w:rPr>
-              <w:t>[ ]</w:t>
-            </w:r>
-          </w:p>
-        </w:tc>
-        <w:tc>
-          <w:tcPr>
-            <w:tcW w:type="dxa" w:w="2351"/>
-          </w:tcPr>
-          <w:p>
-            <w:r>
-              <w:rPr>
-                <w:sz w:val="20"/>
-              </w:rPr>
-              <w:t>[ ]</w:t>
-            </w:r>
-          </w:p>
-        </w:tc>
-        <w:tc>
-          <w:tcPr>
-            <w:tcW w:type="dxa" w:w="2351"/>
-          </w:tcPr>
-          <w:p>
-            <w:r>
-              <w:rPr>
-                <w:sz w:val="20"/>
-              </w:rPr>
-              <w:t>[ ]</w:t>
-            </w:r>
-          </w:p>
-        </w:tc>
-      </w:tr>
-    </w:tbl>
-    <w:p/>
-    <w:p>
-      <w:r>
-        <w:rPr>
-          <w:b w:val="0"/>
-          <w:sz w:val="22"/>
-        </w:rPr>
-        <w:t>Kuupäev: __________  Eesmärk: ________________________________</w:t>
-      </w:r>
-    </w:p>
-    <w:p>
-      <w:r>
-        <w:rPr>
-          <w:b w:val="0"/>
-          <w:sz w:val="22"/>
-        </w:rPr>
-        <w:t>Stress enne: ___ /10    Stress pärast: ___ /10</w:t>
-      </w:r>
-    </w:p>
-    <w:p>
-      <w:r>
-        <w:br w:type="page"/>
+        <w:t>STOP: ava silmad. 5-4-3-2-1 maandamine. Vesi. 116 123 vajadusel.</w:t>
       </w:r>
     </w:p>
     <w:p>
@@ -1954,869 +522,27 @@
         <w:rPr>
           <w:color w:val="1B5E20"/>
         </w:rPr>
-        <w:t>OSA 3 — Plaankonspekt HY1-G (90 min)</w:t>
-      </w:r>
-    </w:p>
-    <w:p>
-      <w:pPr>
-        <w:pStyle w:val="Heading2"/>
-      </w:pPr>
-      <w:r>
-        <w:rPr>
-          <w:color w:val="E65C00"/>
-        </w:rPr>
-        <w:t>Eesmärgid</w:t>
-      </w:r>
-    </w:p>
-    <w:tbl>
-      <w:tblPr>
-        <w:tblStyle w:val="TableGrid"/>
-        <w:tblW w:type="auto" w:w="0"/>
-        <w:tblLook w:firstColumn="1" w:firstRow="1" w:lastColumn="0" w:lastRow="0" w:noHBand="0" w:noVBand="1" w:val="04A0"/>
-      </w:tblPr>
-      <w:tblGrid>
-        <w:gridCol w:w="4703"/>
-        <w:gridCol w:w="4703"/>
-      </w:tblGrid>
-      <w:tr>
-        <w:tc>
-          <w:tcPr>
-            <w:tcW w:type="dxa" w:w="4703"/>
-          </w:tcPr>
-          <w:p>
-            <w:r>
-              <w:rPr>
-                <w:b/>
-                <w:sz w:val="20"/>
-              </w:rPr>
-              <w:t>#</w:t>
-            </w:r>
-          </w:p>
-        </w:tc>
-        <w:tc>
-          <w:tcPr>
-            <w:tcW w:type="dxa" w:w="4703"/>
-          </w:tcPr>
-          <w:p>
-            <w:r>
-              <w:rPr>
-                <w:b/>
-                <w:sz w:val="20"/>
-              </w:rPr>
-              <w:t>Õpiväljund</w:t>
-            </w:r>
-          </w:p>
-        </w:tc>
-      </w:tr>
-      <w:tr>
-        <w:tc>
-          <w:tcPr>
-            <w:tcW w:type="dxa" w:w="4703"/>
-          </w:tcPr>
-          <w:p>
-            <w:r>
-              <w:rPr>
-                <w:sz w:val="20"/>
-              </w:rPr>
-              <w:t>1</w:t>
-            </w:r>
-          </w:p>
-        </w:tc>
-        <w:tc>
-          <w:tcPr>
-            <w:tcW w:type="dxa" w:w="4703"/>
-          </w:tcPr>
-          <w:p>
-            <w:r>
-              <w:rPr>
-                <w:sz w:val="20"/>
-              </w:rPr>
-              <w:t>Selgitab mis hüpnoos on ja mis ei ole</w:t>
-            </w:r>
-          </w:p>
-        </w:tc>
-      </w:tr>
-      <w:tr>
-        <w:tc>
-          <w:tcPr>
-            <w:tcW w:type="dxa" w:w="4703"/>
-          </w:tcPr>
-          <w:p>
-            <w:r>
-              <w:rPr>
-                <w:sz w:val="20"/>
-              </w:rPr>
-              <w:t>2</w:t>
-            </w:r>
-          </w:p>
-        </w:tc>
-        <w:tc>
-          <w:tcPr>
-            <w:tcW w:type="dxa" w:w="4703"/>
-          </w:tcPr>
-          <w:p>
-            <w:r>
-              <w:rPr>
-                <w:sz w:val="20"/>
-              </w:rPr>
-              <w:t>Nimetab STOP reeglid</w:t>
-            </w:r>
-          </w:p>
-        </w:tc>
-      </w:tr>
-      <w:tr>
-        <w:tc>
-          <w:tcPr>
-            <w:tcW w:type="dxa" w:w="4703"/>
-          </w:tcPr>
-          <w:p>
-            <w:r>
-              <w:rPr>
-                <w:sz w:val="20"/>
-              </w:rPr>
-              <w:t>3</w:t>
-            </w:r>
-          </w:p>
-        </w:tc>
-        <w:tc>
-          <w:tcPr>
-            <w:tcW w:type="dxa" w:w="4703"/>
-          </w:tcPr>
-          <w:p>
-            <w:r>
-              <w:rPr>
-                <w:sz w:val="20"/>
-              </w:rPr>
-              <w:t>Teostab HY1 protokolli ise (15 min)</w:t>
-            </w:r>
-          </w:p>
-        </w:tc>
-      </w:tr>
-      <w:tr>
-        <w:tc>
-          <w:tcPr>
-            <w:tcW w:type="dxa" w:w="4703"/>
-          </w:tcPr>
-          <w:p>
-            <w:r>
-              <w:rPr>
-                <w:sz w:val="20"/>
-              </w:rPr>
-              <w:t>4</w:t>
-            </w:r>
-          </w:p>
-        </w:tc>
-        <w:tc>
-          <w:tcPr>
-            <w:tcW w:type="dxa" w:w="4703"/>
-          </w:tcPr>
-          <w:p>
-            <w:r>
-              <w:rPr>
-                <w:sz w:val="20"/>
-              </w:rPr>
-              <w:t>Juhib 5-min kiirvarianti</w:t>
-            </w:r>
-          </w:p>
-        </w:tc>
-      </w:tr>
-      <w:tr>
-        <w:tc>
-          <w:tcPr>
-            <w:tcW w:type="dxa" w:w="4703"/>
-          </w:tcPr>
-          <w:p>
-            <w:r>
-              <w:rPr>
-                <w:sz w:val="20"/>
-              </w:rPr>
-              <w:t>5</w:t>
-            </w:r>
-          </w:p>
-        </w:tc>
-        <w:tc>
-          <w:tcPr>
-            <w:tcW w:type="dxa" w:w="4703"/>
-          </w:tcPr>
-          <w:p>
-            <w:r>
-              <w:rPr>
-                <w:sz w:val="20"/>
-              </w:rPr>
-              <w:t>Teeb teadliku valiku spetsialisti poole</w:t>
-            </w:r>
-          </w:p>
-        </w:tc>
-      </w:tr>
-      <w:tr>
-        <w:tc>
-          <w:tcPr>
-            <w:tcW w:type="dxa" w:w="4703"/>
-          </w:tcPr>
-          <w:p>
-            <w:r>
-              <w:rPr>
-                <w:sz w:val="20"/>
-              </w:rPr>
-              <w:t>6</w:t>
-            </w:r>
-          </w:p>
-        </w:tc>
-        <w:tc>
-          <w:tcPr>
-            <w:tcW w:type="dxa" w:w="4703"/>
-          </w:tcPr>
-          <w:p>
-            <w:r>
-              <w:rPr>
-                <w:sz w:val="20"/>
-              </w:rPr>
-              <w:t>Kirjutab ühe integratsioonilause (debrief)</w:t>
-            </w:r>
-          </w:p>
-        </w:tc>
-      </w:tr>
-    </w:tbl>
-    <w:p/>
-    <w:p>
-      <w:pPr>
-        <w:pStyle w:val="Heading2"/>
-      </w:pPr>
-      <w:r>
-        <w:rPr>
-          <w:color w:val="E65C00"/>
-        </w:rPr>
-        <w:t>Tunnikava</w:t>
-      </w:r>
-    </w:p>
-    <w:tbl>
-      <w:tblPr>
-        <w:tblStyle w:val="TableGrid"/>
-        <w:tblW w:type="auto" w:w="0"/>
-        <w:tblLook w:firstColumn="1" w:firstRow="1" w:lastColumn="0" w:lastRow="0" w:noHBand="0" w:noVBand="1" w:val="04A0"/>
-      </w:tblPr>
-      <w:tblGrid>
-        <w:gridCol w:w="3135"/>
-        <w:gridCol w:w="3135"/>
-        <w:gridCol w:w="3135"/>
-      </w:tblGrid>
-      <w:tr>
-        <w:tc>
-          <w:tcPr>
-            <w:tcW w:type="dxa" w:w="3135"/>
-          </w:tcPr>
-          <w:p>
-            <w:r>
-              <w:rPr>
-                <w:b/>
-                <w:sz w:val="20"/>
-              </w:rPr>
-              <w:t>Aeg</w:t>
-            </w:r>
-          </w:p>
-        </w:tc>
-        <w:tc>
-          <w:tcPr>
-            <w:tcW w:type="dxa" w:w="3135"/>
-          </w:tcPr>
-          <w:p>
-            <w:r>
-              <w:rPr>
-                <w:b/>
-                <w:sz w:val="20"/>
-              </w:rPr>
-              <w:t>Faas</w:t>
-            </w:r>
-          </w:p>
-        </w:tc>
-        <w:tc>
-          <w:tcPr>
-            <w:tcW w:type="dxa" w:w="3135"/>
-          </w:tcPr>
-          <w:p>
-            <w:r>
-              <w:rPr>
-                <w:b/>
-                <w:sz w:val="20"/>
-              </w:rPr>
-              <w:t>Peamine tegevus</w:t>
-            </w:r>
-          </w:p>
-        </w:tc>
-      </w:tr>
-      <w:tr>
-        <w:tc>
-          <w:tcPr>
-            <w:tcW w:type="dxa" w:w="3135"/>
-          </w:tcPr>
-          <w:p>
-            <w:r>
-              <w:rPr>
-                <w:sz w:val="20"/>
-              </w:rPr>
-              <w:t>0-10</w:t>
-            </w:r>
-          </w:p>
-        </w:tc>
-        <w:tc>
-          <w:tcPr>
-            <w:tcW w:type="dxa" w:w="3135"/>
-          </w:tcPr>
-          <w:p>
-            <w:r>
-              <w:rPr>
-                <w:sz w:val="20"/>
-              </w:rPr>
-              <w:t>Avamine</w:t>
-            </w:r>
-          </w:p>
-        </w:tc>
-        <w:tc>
-          <w:tcPr>
-            <w:tcW w:type="dxa" w:w="3135"/>
-          </w:tcPr>
-          <w:p>
-            <w:r>
-              <w:rPr>
-                <w:sz w:val="20"/>
-              </w:rPr>
-              <w:t>Reeglid, STOP, üks sõna kehast, SWOT 2 min</w:t>
-            </w:r>
-          </w:p>
-        </w:tc>
-      </w:tr>
-      <w:tr>
-        <w:tc>
-          <w:tcPr>
-            <w:tcW w:type="dxa" w:w="3135"/>
-          </w:tcPr>
-          <w:p>
-            <w:r>
-              <w:rPr>
-                <w:sz w:val="20"/>
-              </w:rPr>
-              <w:t>10-25</w:t>
-            </w:r>
-          </w:p>
-        </w:tc>
-        <w:tc>
-          <w:tcPr>
-            <w:tcW w:type="dxa" w:w="3135"/>
-          </w:tcPr>
-          <w:p>
-            <w:r>
-              <w:rPr>
-                <w:sz w:val="20"/>
-              </w:rPr>
-              <w:t>Mis on hüpnoos?</w:t>
-            </w:r>
-          </w:p>
-        </w:tc>
-        <w:tc>
-          <w:tcPr>
-            <w:tcW w:type="dxa" w:w="3135"/>
-          </w:tcPr>
-          <w:p>
-            <w:r>
-              <w:rPr>
-                <w:sz w:val="20"/>
-              </w:rPr>
-              <w:t>Definitsioon, mida EI ole, paarivestlus</w:t>
-            </w:r>
-          </w:p>
-        </w:tc>
-      </w:tr>
-      <w:tr>
-        <w:tc>
-          <w:tcPr>
-            <w:tcW w:type="dxa" w:w="3135"/>
-          </w:tcPr>
-          <w:p>
-            <w:r>
-              <w:rPr>
-                <w:sz w:val="20"/>
-              </w:rPr>
-              <w:t>25-35</w:t>
-            </w:r>
-          </w:p>
-        </w:tc>
-        <w:tc>
-          <w:tcPr>
-            <w:tcW w:type="dxa" w:w="3135"/>
-          </w:tcPr>
-          <w:p>
-            <w:r>
-              <w:rPr>
-                <w:sz w:val="20"/>
-              </w:rPr>
-              <w:t>Tõendus ja piirid</w:t>
-            </w:r>
-          </w:p>
-        </w:tc>
-        <w:tc>
-          <w:tcPr>
-            <w:tcW w:type="dxa" w:w="3135"/>
-          </w:tcPr>
-          <w:p>
-            <w:r>
-              <w:rPr>
-                <w:sz w:val="20"/>
-              </w:rPr>
-              <w:t>Kus aitab / ei aita / spetsialist</w:t>
-            </w:r>
-          </w:p>
-        </w:tc>
-      </w:tr>
-      <w:tr>
-        <w:tc>
-          <w:tcPr>
-            <w:tcW w:type="dxa" w:w="3135"/>
-          </w:tcPr>
-          <w:p>
-            <w:r>
-              <w:rPr>
-                <w:sz w:val="20"/>
-              </w:rPr>
-              <w:t>35-50</w:t>
-            </w:r>
-          </w:p>
-        </w:tc>
-        <w:tc>
-          <w:tcPr>
-            <w:tcW w:type="dxa" w:w="3135"/>
-          </w:tcPr>
-          <w:p>
-            <w:r>
-              <w:rPr>
-                <w:sz w:val="20"/>
-              </w:rPr>
-              <w:t>Demo</w:t>
-            </w:r>
-          </w:p>
-        </w:tc>
-        <w:tc>
-          <w:tcPr>
-            <w:tcW w:type="dxa" w:w="3135"/>
-          </w:tcPr>
-          <w:p>
-            <w:r>
-              <w:rPr>
-                <w:sz w:val="20"/>
-              </w:rPr>
-              <w:t>Grupi lühike HY1 — stress enne/pärast</w:t>
-            </w:r>
-          </w:p>
-        </w:tc>
-      </w:tr>
-      <w:tr>
-        <w:tc>
-          <w:tcPr>
-            <w:tcW w:type="dxa" w:w="3135"/>
-          </w:tcPr>
-          <w:p>
-            <w:r>
-              <w:rPr>
-                <w:sz w:val="20"/>
-              </w:rPr>
-              <w:t>50-65</w:t>
-            </w:r>
-          </w:p>
-        </w:tc>
-        <w:tc>
-          <w:tcPr>
-            <w:tcW w:type="dxa" w:w="3135"/>
-          </w:tcPr>
-          <w:p>
-            <w:r>
-              <w:rPr>
-                <w:sz w:val="20"/>
-              </w:rPr>
-              <w:t>Iseseisev</w:t>
-            </w:r>
-          </w:p>
-        </w:tc>
-        <w:tc>
-          <w:tcPr>
-            <w:tcW w:type="dxa" w:w="3135"/>
-          </w:tcPr>
-          <w:p>
-            <w:r>
-              <w:rPr>
-                <w:sz w:val="20"/>
-              </w:rPr>
-              <w:t>12 min vaikne praktika, üks kerge eesmärk</w:t>
-            </w:r>
-          </w:p>
-        </w:tc>
-      </w:tr>
-      <w:tr>
-        <w:tc>
-          <w:tcPr>
-            <w:tcW w:type="dxa" w:w="3135"/>
-          </w:tcPr>
-          <w:p>
-            <w:r>
-              <w:rPr>
-                <w:sz w:val="20"/>
-              </w:rPr>
-              <w:t>65-75</w:t>
-            </w:r>
-          </w:p>
-        </w:tc>
-        <w:tc>
-          <w:tcPr>
-            <w:tcW w:type="dxa" w:w="3135"/>
-          </w:tcPr>
-          <w:p>
-            <w:r>
-              <w:rPr>
-                <w:sz w:val="20"/>
-              </w:rPr>
-              <w:t>Paariline</w:t>
-            </w:r>
-          </w:p>
-        </w:tc>
-        <w:tc>
-          <w:tcPr>
-            <w:tcW w:type="dxa" w:w="3135"/>
-          </w:tcPr>
-          <w:p>
-            <w:r>
-              <w:rPr>
-                <w:sz w:val="20"/>
-              </w:rPr>
-              <w:t>5-min skript, vahetus</w:t>
-            </w:r>
-          </w:p>
-        </w:tc>
-      </w:tr>
-      <w:tr>
-        <w:tc>
-          <w:tcPr>
-            <w:tcW w:type="dxa" w:w="3135"/>
-          </w:tcPr>
-          <w:p>
-            <w:r>
-              <w:rPr>
-                <w:sz w:val="20"/>
-              </w:rPr>
-              <w:t>75-85</w:t>
-            </w:r>
-          </w:p>
-        </w:tc>
-        <w:tc>
-          <w:tcPr>
-            <w:tcW w:type="dxa" w:w="3135"/>
-          </w:tcPr>
-          <w:p>
-            <w:r>
-              <w:rPr>
-                <w:sz w:val="20"/>
-              </w:rPr>
-              <w:t>Debrief</w:t>
-            </w:r>
-          </w:p>
-        </w:tc>
-        <w:tc>
-          <w:tcPr>
-            <w:tcW w:type="dxa" w:w="3135"/>
-          </w:tcPr>
-          <w:p>
-            <w:r>
-              <w:rPr>
-                <w:sz w:val="20"/>
-              </w:rPr>
-              <w:t>Üks lause ringis — mis muutus?</w:t>
-            </w:r>
-          </w:p>
-        </w:tc>
-      </w:tr>
-      <w:tr>
-        <w:tc>
-          <w:tcPr>
-            <w:tcW w:type="dxa" w:w="3135"/>
-          </w:tcPr>
-          <w:p>
-            <w:r>
-              <w:rPr>
-                <w:sz w:val="20"/>
-              </w:rPr>
-              <w:t>85-90</w:t>
-            </w:r>
-          </w:p>
-        </w:tc>
-        <w:tc>
-          <w:tcPr>
-            <w:tcW w:type="dxa" w:w="3135"/>
-          </w:tcPr>
-          <w:p>
-            <w:r>
-              <w:rPr>
-                <w:sz w:val="20"/>
-              </w:rPr>
-              <w:t>Lõpetus</w:t>
-            </w:r>
-          </w:p>
-        </w:tc>
-        <w:tc>
-          <w:tcPr>
-            <w:tcW w:type="dxa" w:w="3135"/>
-          </w:tcPr>
-          <w:p>
-            <w:r>
-              <w:rPr>
-                <w:sz w:val="20"/>
-              </w:rPr>
-              <w:t>Kodutöö, HY1 kaart kaasa</w:t>
-            </w:r>
-          </w:p>
-        </w:tc>
-      </w:tr>
-    </w:tbl>
-    <w:p/>
-    <w:p>
-      <w:pPr>
-        <w:pStyle w:val="Heading2"/>
-      </w:pPr>
-      <w:r>
-        <w:rPr>
-          <w:color w:val="E65C00"/>
-        </w:rPr>
-        <w:t>Koolitaja skript — võtmehetked</w:t>
-      </w:r>
-    </w:p>
-    <w:p>
-      <w:pPr>
-        <w:ind w:left="567"/>
-      </w:pPr>
-      <w:r>
-        <w:rPr>
-          <w:i/>
-          <w:color w:val="1B5E20"/>
-          <w:sz w:val="20"/>
-        </w:rPr>
-        <w:t>Täna ei muuda me teid kellegi teistsuguseks. Me harime fookust ja rahunemist. Te saate igal hetkel silmad avada. Üks eesmärk korraga.</w:t>
-      </w:r>
-    </w:p>
-    <w:p>
-      <w:pPr>
-        <w:ind w:left="567"/>
-      </w:pPr>
-      <w:r>
-        <w:rPr>
-          <w:i/>
-          <w:color w:val="1B5E20"/>
-          <w:sz w:val="20"/>
-        </w:rPr>
-        <w:t>Kui distress läheb 8 — STOP. Me ei ava raskeid minevikuid. See on eneseregulatsioon, mitte raviseanss.</w:t>
-      </w:r>
-    </w:p>
-    <w:p>
-      <w:pPr>
-        <w:pStyle w:val="Heading2"/>
-      </w:pPr>
-      <w:r>
-        <w:rPr>
-          <w:color w:val="E65C00"/>
-        </w:rPr>
-        <w:t>Kodutöö (7 päeva)</w:t>
-      </w:r>
-    </w:p>
-    <w:tbl>
-      <w:tblPr>
-        <w:tblStyle w:val="TableGrid"/>
-        <w:tblW w:type="auto" w:w="0"/>
-        <w:tblLook w:firstColumn="1" w:firstRow="1" w:lastColumn="0" w:lastRow="0" w:noHBand="0" w:noVBand="1" w:val="04A0"/>
-      </w:tblPr>
-      <w:tblGrid>
-        <w:gridCol w:w="4703"/>
-        <w:gridCol w:w="4703"/>
-      </w:tblGrid>
-      <w:tr>
-        <w:tc>
-          <w:tcPr>
-            <w:tcW w:type="dxa" w:w="4703"/>
-          </w:tcPr>
-          <w:p>
-            <w:r>
-              <w:rPr>
-                <w:b/>
-                <w:sz w:val="20"/>
-              </w:rPr>
-              <w:t>Päev</w:t>
-            </w:r>
-          </w:p>
-        </w:tc>
-        <w:tc>
-          <w:tcPr>
-            <w:tcW w:type="dxa" w:w="4703"/>
-          </w:tcPr>
-          <w:p>
-            <w:r>
-              <w:rPr>
-                <w:b/>
-                <w:sz w:val="20"/>
-              </w:rPr>
-              <w:t>Ülesanne</w:t>
-            </w:r>
-          </w:p>
-        </w:tc>
-      </w:tr>
-      <w:tr>
-        <w:tc>
-          <w:tcPr>
-            <w:tcW w:type="dxa" w:w="4703"/>
-          </w:tcPr>
-          <w:p>
-            <w:r>
-              <w:rPr>
-                <w:sz w:val="20"/>
-              </w:rPr>
-              <w:t>1-3</w:t>
-            </w:r>
-          </w:p>
-        </w:tc>
-        <w:tc>
-          <w:tcPr>
-            <w:tcW w:type="dxa" w:w="4703"/>
-          </w:tcPr>
-          <w:p>
-            <w:r>
-              <w:rPr>
-                <w:sz w:val="20"/>
-              </w:rPr>
-              <w:t>1× HY1 (15 min) — logi stress enne/pärast</w:t>
-            </w:r>
-          </w:p>
-        </w:tc>
-      </w:tr>
-      <w:tr>
-        <w:tc>
-          <w:tcPr>
-            <w:tcW w:type="dxa" w:w="4703"/>
-          </w:tcPr>
-          <w:p>
-            <w:r>
-              <w:rPr>
-                <w:sz w:val="20"/>
-              </w:rPr>
-              <w:t>4</w:t>
-            </w:r>
-          </w:p>
-        </w:tc>
-        <w:tc>
-          <w:tcPr>
-            <w:tcW w:type="dxa" w:w="4703"/>
-          </w:tcPr>
-          <w:p>
-            <w:r>
-              <w:rPr>
-                <w:sz w:val="20"/>
-              </w:rPr>
-              <w:t>1× 5-min kiirvariant enne olulist tegevust</w:t>
-            </w:r>
-          </w:p>
-        </w:tc>
-      </w:tr>
-      <w:tr>
-        <w:tc>
-          <w:tcPr>
-            <w:tcW w:type="dxa" w:w="4703"/>
-          </w:tcPr>
-          <w:p>
-            <w:r>
-              <w:rPr>
-                <w:sz w:val="20"/>
-              </w:rPr>
-              <w:t>5</w:t>
-            </w:r>
-          </w:p>
-        </w:tc>
-        <w:tc>
-          <w:tcPr>
-            <w:tcW w:type="dxa" w:w="4703"/>
-          </w:tcPr>
-          <w:p>
-            <w:r>
-              <w:rPr>
-                <w:sz w:val="20"/>
-              </w:rPr>
-              <w:t>Loe SWOT uuesti läbi</w:t>
-            </w:r>
-          </w:p>
-        </w:tc>
-      </w:tr>
-      <w:tr>
-        <w:tc>
-          <w:tcPr>
-            <w:tcW w:type="dxa" w:w="4703"/>
-          </w:tcPr>
-          <w:p>
-            <w:r>
-              <w:rPr>
-                <w:sz w:val="20"/>
-              </w:rPr>
-              <w:t>6-7</w:t>
-            </w:r>
-          </w:p>
-        </w:tc>
-        <w:tc>
-          <w:tcPr>
-            <w:tcW w:type="dxa" w:w="4703"/>
-          </w:tcPr>
-          <w:p>
-            <w:r>
-              <w:rPr>
-                <w:sz w:val="20"/>
-              </w:rPr>
-              <w:t>1× paariline HY1 või debrief pärast sessiooni</w:t>
-            </w:r>
-          </w:p>
-        </w:tc>
-      </w:tr>
-    </w:tbl>
-    <w:p/>
-    <w:p>
-      <w:pPr>
-        <w:pStyle w:val="Heading2"/>
-      </w:pPr>
-      <w:r>
-        <w:rPr>
-          <w:color w:val="E65C00"/>
-        </w:rPr>
-        <w:t>Tunnistus (valikuline)</w:t>
+        <w:t>6. Kiire viide</w:t>
       </w:r>
     </w:p>
     <w:p>
       <w:r>
         <w:rPr>
           <w:b w:val="0"/>
+          <w:i w:val="0"/>
           <w:sz w:val="22"/>
         </w:rPr>
-        <w:t>Mina, ___________________________, osalesin HY1-G koolitusel „Hünoteraapia algteadmised".</w:t>
+        <w:t>Ankur → Keha → Turvakoht → Suggestioon 8-12 min → Tagasi 5-1 → Vesi → Mis muutus?</w:t>
       </w:r>
     </w:p>
     <w:p>
       <w:r>
         <w:rPr>
           <w:b w:val="0"/>
+          <w:i w:val="0"/>
           <w:sz w:val="22"/>
         </w:rPr>
-        <w:t>Kohustun kasutama STOP reegleid.</w:t>
-      </w:r>
-    </w:p>
-    <w:p>
-      <w:r>
-        <w:rPr>
-          <w:b w:val="0"/>
-          <w:sz w:val="22"/>
-        </w:rPr>
-        <w:t>Kuupäev: ______________    Allkiri: ___________________________</w:t>
-      </w:r>
-    </w:p>
-    <w:p>
-      <w:r>
-        <w:br w:type="page"/>
+        <w:t>Aeg: 15-25 min | Stop: distress &gt; 8 | Meetodid: ise · salvestis · paariline</w:t>
       </w:r>
     </w:p>
     <w:p>
@@ -2827,443 +553,39 @@
         <w:rPr>
           <w:color w:val="1B5E20"/>
         </w:rPr>
-        <w:t>OSA 4 — Hüpnoosi test nr. 1 (kaaslasega)</w:t>
+        <w:t>7. Näited algajale</w:t>
       </w:r>
     </w:p>
     <w:p>
       <w:r>
         <w:rPr>
           <w:b/>
+          <w:i w:val="0"/>
           <w:sz w:val="22"/>
         </w:rPr>
-        <w:t>Iga mees saab seda õppida ja teha oma kaaslasele. Vorm: kaitseväe Automaadi test nr. 1 eeskujul.</w:t>
-      </w:r>
-    </w:p>
-    <w:p>
-      <w:pPr>
-        <w:pStyle w:val="Heading2"/>
-      </w:pPr>
-      <w:r>
-        <w:rPr>
-          <w:color w:val="E65C00"/>
-        </w:rPr>
-        <w:t>Õppetunni eesmärk</w:t>
+        <w:t>Ise — uneärevus: Eesmärk magama. Distress 6→3. 15 min.</w:t>
       </w:r>
     </w:p>
     <w:p>
       <w:r>
         <w:rPr>
-          <w:b w:val="0"/>
+          <w:b/>
+          <w:i w:val="0"/>
           <w:sz w:val="22"/>
         </w:rPr>
-        <w:t>Kontrollida turvalise hüpnoosi juhtimise taset kaaslasega — 15 min protokoll ilma OT vigadeta.</w:t>
-      </w:r>
-    </w:p>
-    <w:p>
-      <w:pPr>
-        <w:pStyle w:val="Heading2"/>
-      </w:pPr>
-      <w:r>
-        <w:rPr>
-          <w:color w:val="E65C00"/>
-        </w:rPr>
-        <w:t>OT vead (test mittesooritatud)</w:t>
-      </w:r>
-    </w:p>
-    <w:p>
-      <w:pPr>
-        <w:pStyle w:val="ListBullet"/>
-      </w:pPr>
-      <w:r>
-        <w:t>Sundib silmi kinni / keelab lõpetamise</w:t>
-      </w:r>
-    </w:p>
-    <w:p>
-      <w:pPr>
-        <w:pStyle w:val="ListBullet"/>
-      </w:pPr>
-      <w:r>
-        <w:t>Avab trauma ilma spetsialistita</w:t>
-      </w:r>
-    </w:p>
-    <w:p>
-      <w:pPr>
-        <w:pStyle w:val="ListBullet"/>
-      </w:pPr>
-      <w:r>
-        <w:t>Jätkab kui distress &gt; 8/10</w:t>
-      </w:r>
-    </w:p>
-    <w:p>
-      <w:pPr>
-        <w:pStyle w:val="ListBullet"/>
-      </w:pPr>
-      <w:r>
-        <w:t>Diagnoosib või lubab meditsiinilist väidet</w:t>
-      </w:r>
-    </w:p>
-    <w:p>
-      <w:pPr>
-        <w:pStyle w:val="ListBullet"/>
-      </w:pPr>
-      <w:r>
-        <w:t>Alustab ilma nõusolekuta</w:t>
-      </w:r>
-    </w:p>
-    <w:p>
-      <w:pPr>
-        <w:pStyle w:val="Heading2"/>
-      </w:pPr>
-      <w:r>
-        <w:rPr>
-          <w:color w:val="E65C00"/>
-        </w:rPr>
-        <w:t>Protseduur — peamised käsklused</w:t>
-      </w:r>
-    </w:p>
-    <w:tbl>
-      <w:tblPr>
-        <w:tblStyle w:val="TableGrid"/>
-        <w:tblW w:type="auto" w:w="0"/>
-        <w:tblLook w:firstColumn="1" w:firstRow="1" w:lastColumn="0" w:lastRow="0" w:noHBand="0" w:noVBand="1" w:val="04A0"/>
-      </w:tblPr>
-      <w:tblGrid>
-        <w:gridCol w:w="4703"/>
-        <w:gridCol w:w="4703"/>
-      </w:tblGrid>
-      <w:tr>
-        <w:tc>
-          <w:tcPr>
-            <w:tcW w:type="dxa" w:w="4703"/>
-          </w:tcPr>
-          <w:p>
-            <w:r>
-              <w:rPr>
-                <w:b/>
-                <w:sz w:val="20"/>
-              </w:rPr>
-              <w:t>#</w:t>
-            </w:r>
-          </w:p>
-        </w:tc>
-        <w:tc>
-          <w:tcPr>
-            <w:tcW w:type="dxa" w:w="4703"/>
-          </w:tcPr>
-          <w:p>
-            <w:r>
-              <w:rPr>
-                <w:b/>
-                <w:sz w:val="20"/>
-              </w:rPr>
-              <w:t>Käsklus</w:t>
-            </w:r>
-          </w:p>
-        </w:tc>
-      </w:tr>
-      <w:tr>
-        <w:tc>
-          <w:tcPr>
-            <w:tcW w:type="dxa" w:w="4703"/>
-          </w:tcPr>
-          <w:p>
-            <w:r>
-              <w:rPr>
-                <w:sz w:val="20"/>
-              </w:rPr>
-              <w:t>1</w:t>
-            </w:r>
-          </w:p>
-        </w:tc>
-        <w:tc>
-          <w:tcPr>
-            <w:tcW w:type="dxa" w:w="4703"/>
-          </w:tcPr>
-          <w:p>
-            <w:r>
-              <w:rPr>
-                <w:sz w:val="20"/>
-              </w:rPr>
-              <w:t>Liikuge vaiksesse ruumi ja tehke ohutuskontroll</w:t>
-            </w:r>
-          </w:p>
-        </w:tc>
-      </w:tr>
-      <w:tr>
-        <w:tc>
-          <w:tcPr>
-            <w:tcW w:type="dxa" w:w="4703"/>
-          </w:tcPr>
-          <w:p>
-            <w:r>
-              <w:rPr>
-                <w:sz w:val="20"/>
-              </w:rPr>
-              <w:t>2</w:t>
-            </w:r>
-          </w:p>
-        </w:tc>
-        <w:tc>
-          <w:tcPr>
-            <w:tcW w:type="dxa" w:w="4703"/>
-          </w:tcPr>
-          <w:p>
-            <w:r>
-              <w:rPr>
-                <w:sz w:val="20"/>
-              </w:rPr>
-              <w:t>Lepi kokku üks eesmärk</w:t>
-            </w:r>
-          </w:p>
-        </w:tc>
-      </w:tr>
-      <w:tr>
-        <w:tc>
-          <w:tcPr>
-            <w:tcW w:type="dxa" w:w="4703"/>
-          </w:tcPr>
-          <w:p>
-            <w:r>
-              <w:rPr>
-                <w:sz w:val="20"/>
-              </w:rPr>
-              <w:t>3</w:t>
-            </w:r>
-          </w:p>
-        </w:tc>
-        <w:tc>
-          <w:tcPr>
-            <w:tcW w:type="dxa" w:w="4703"/>
-          </w:tcPr>
-          <w:p>
-            <w:r>
-              <w:rPr>
-                <w:sz w:val="20"/>
-              </w:rPr>
-              <w:t>Sul on alati kontroll. Ava silmad igal hetkel</w:t>
-            </w:r>
-          </w:p>
-        </w:tc>
-      </w:tr>
-      <w:tr>
-        <w:tc>
-          <w:tcPr>
-            <w:tcW w:type="dxa" w:w="4703"/>
-          </w:tcPr>
-          <w:p>
-            <w:r>
-              <w:rPr>
-                <w:sz w:val="20"/>
-              </w:rPr>
-              <w:t>4</w:t>
-            </w:r>
-          </w:p>
-        </w:tc>
-        <w:tc>
-          <w:tcPr>
-            <w:tcW w:type="dxa" w:w="4703"/>
-          </w:tcPr>
-          <w:p>
-            <w:r>
-              <w:rPr>
-                <w:sz w:val="20"/>
-              </w:rPr>
-              <w:t>Ankur — sisse 4, välja 6 × 3</w:t>
-            </w:r>
-          </w:p>
-        </w:tc>
-      </w:tr>
-      <w:tr>
-        <w:tc>
-          <w:tcPr>
-            <w:tcW w:type="dxa" w:w="4703"/>
-          </w:tcPr>
-          <w:p>
-            <w:r>
-              <w:rPr>
-                <w:sz w:val="20"/>
-              </w:rPr>
-              <w:t>5</w:t>
-            </w:r>
-          </w:p>
-        </w:tc>
-        <w:tc>
-          <w:tcPr>
-            <w:tcW w:type="dxa" w:w="4703"/>
-          </w:tcPr>
-          <w:p>
-            <w:r>
-              <w:rPr>
-                <w:sz w:val="20"/>
-              </w:rPr>
-              <w:t>Keha skaneering → Turvakoht → Suggestioon 8-12 min</w:t>
-            </w:r>
-          </w:p>
-        </w:tc>
-      </w:tr>
-      <w:tr>
-        <w:tc>
-          <w:tcPr>
-            <w:tcW w:type="dxa" w:w="4703"/>
-          </w:tcPr>
-          <w:p>
-            <w:r>
-              <w:rPr>
-                <w:sz w:val="20"/>
-              </w:rPr>
-              <w:t>6</w:t>
-            </w:r>
-          </w:p>
-        </w:tc>
-        <w:tc>
-          <w:tcPr>
-            <w:tcW w:type="dxa" w:w="4703"/>
-          </w:tcPr>
-          <w:p>
-            <w:r>
-              <w:rPr>
-                <w:sz w:val="20"/>
-              </w:rPr>
-              <w:t>Tagasi 5-1 → Vesi → Mis muutus?</w:t>
-            </w:r>
-          </w:p>
-        </w:tc>
-      </w:tr>
-    </w:tbl>
-    <w:p/>
-    <w:p>
-      <w:pPr>
-        <w:pStyle w:val="Heading2"/>
-      </w:pPr>
-      <w:r>
-        <w:rPr>
-          <w:color w:val="E65C00"/>
-        </w:rPr>
-        <w:t>Hindamine</w:t>
+        <w:t>Paar — enne koosolekut: Abiline loeb. 12 min. Distress langeb.</w:t>
       </w:r>
     </w:p>
     <w:p>
       <w:r>
         <w:rPr>
-          <w:b w:val="0"/>
+          <w:b/>
+          <w:i w:val="0"/>
           <w:sz w:val="22"/>
         </w:rPr>
-        <w:t>Sooritatud: 0 OT viga + min 14 punkti 18-st. Kaaslane kinnitab: Sain igal hetkel lõpetada.</w:t>
+        <w:t>Mees kaaslasele: 15 min HY1. Debrief 1 lause.</w:t>
       </w:r>
     </w:p>
-    <w:p>
-      <w:r>
-        <w:br w:type="page"/>
-      </w:r>
-    </w:p>
-    <w:p>
-      <w:pPr>
-        <w:pStyle w:val="Heading2"/>
-      </w:pPr>
-      <w:r>
-        <w:rPr>
-          <w:color w:val="E65C00"/>
-        </w:rPr>
-        <w:t>Allkiri — HY1 kasutamine</w:t>
-      </w:r>
-    </w:p>
-    <w:tbl>
-      <w:tblPr>
-        <w:tblStyle w:val="TableGrid"/>
-        <w:tblW w:type="auto" w:w="0"/>
-        <w:tblLook w:firstColumn="1" w:firstRow="1" w:lastColumn="0" w:lastRow="0" w:noHBand="0" w:noVBand="1" w:val="04A0"/>
-      </w:tblPr>
-      <w:tblGrid>
-        <w:gridCol w:w="4703"/>
-        <w:gridCol w:w="4703"/>
-      </w:tblGrid>
-      <w:tr>
-        <w:tc>
-          <w:tcPr>
-            <w:tcW w:type="dxa" w:w="4703"/>
-          </w:tcPr>
-          <w:p>
-            <w:r>
-              <w:rPr>
-                <w:b/>
-                <w:sz w:val="20"/>
-              </w:rPr>
-              <w:t>Roll</w:t>
-            </w:r>
-          </w:p>
-        </w:tc>
-        <w:tc>
-          <w:tcPr>
-            <w:tcW w:type="dxa" w:w="4703"/>
-          </w:tcPr>
-          <w:p>
-            <w:r>
-              <w:rPr>
-                <w:b/>
-                <w:sz w:val="20"/>
-              </w:rPr>
-              <w:t>Allkiri / kuupäev</w:t>
-            </w:r>
-          </w:p>
-        </w:tc>
-      </w:tr>
-      <w:tr>
-        <w:tc>
-          <w:tcPr>
-            <w:tcW w:type="dxa" w:w="4703"/>
-          </w:tcPr>
-          <w:p>
-            <w:r>
-              <w:rPr>
-                <w:sz w:val="20"/>
-              </w:rPr>
-              <w:t>Osaleja / praktik</w:t>
-            </w:r>
-          </w:p>
-        </w:tc>
-        <w:tc>
-          <w:tcPr>
-            <w:tcW w:type="dxa" w:w="4703"/>
-          </w:tcPr>
-          <w:p>
-            <w:r>
-              <w:rPr>
-                <w:sz w:val="20"/>
-              </w:rPr>
-              <w:t>________________  __________</w:t>
-            </w:r>
-          </w:p>
-        </w:tc>
-      </w:tr>
-      <w:tr>
-        <w:tc>
-          <w:tcPr>
-            <w:tcW w:type="dxa" w:w="4703"/>
-          </w:tcPr>
-          <w:p>
-            <w:r>
-              <w:rPr>
-                <w:sz w:val="20"/>
-              </w:rPr>
-              <w:t>Juht / koolitaja</w:t>
-            </w:r>
-          </w:p>
-        </w:tc>
-        <w:tc>
-          <w:tcPr>
-            <w:tcW w:type="dxa" w:w="4703"/>
-          </w:tcPr>
-          <w:p>
-            <w:r>
-              <w:rPr>
-                <w:sz w:val="20"/>
-              </w:rPr>
-              <w:t>________________  __________</w:t>
-            </w:r>
-          </w:p>
-        </w:tc>
-      </w:tr>
-    </w:tbl>
     <w:p/>
     <w:p>
       <w:pPr>
@@ -3271,10 +593,13 @@
       </w:pPr>
       <w:r>
         <w:rPr>
+          <w:i/>
           <w:color w:val="555555"/>
           <w:sz w:val="18"/>
         </w:rPr>
-        <w:t>HY1 v1.2  |  16.08.2026  |  Unpluged-Al  |  hypnoteraapia-test-nr1-kaaslasega.md</w:t>
+        <w:t>See juhend on hariduslik. Ei asenda psühholoogi ega hünoterapeudi abi.</w:t>
+        <w:br/>
+        <w:t>Unpluged-Al · HY1 v2.0 · 16.08.2026</w:t>
       </w:r>
     </w:p>
     <w:sectPr>

</xml_diff>